<commit_message>
docs(report): snapshot Word-saved docx (TOC field numbers applied); ignore Word lock files (~$*)
</commit_message>
<xml_diff>
--- a/report/SmartHome-Project-Report.docx
+++ b/report/SmartHome-Project-Report.docx
@@ -5,9 +5,6 @@
     <w:p>
       <w:pPr>
         <w:spacing w:before="4400"/>
-        <w:rPr>
-          <w:rFonts w:hint="cs"/>
-        </w:rPr>
       </w:pPr>
     </w:p>
     <w:p>
@@ -457,14 +454,12 @@
     </w:p>
     <w:sdt>
       <w:sdtPr>
+        <w:rPr>
+          <w:rtl/>
+        </w:rPr>
         <w:alias w:val="Table of Contents"/>
         <w:id w:val="3786482"/>
       </w:sdtPr>
-      <w:sdtEndPr>
-        <w:rPr>
-          <w:rtl/>
-        </w:rPr>
-      </w:sdtEndPr>
       <w:sdtContent>
         <w:p>
           <w:pPr>
@@ -472,7 +467,6 @@
             <w:tabs>
               <w:tab w:val="right" w:leader="dot" w:pos="8778"/>
             </w:tabs>
-            <w:bidi w:val="0"/>
             <w:rPr>
               <w:rFonts w:asciiTheme="minorHAnsi" w:eastAsiaTheme="minorEastAsia" w:hAnsiTheme="minorHAnsi" w:cstheme="minorBidi"/>
               <w:noProof/>
@@ -558,7 +552,6 @@
             <w:tabs>
               <w:tab w:val="right" w:leader="dot" w:pos="8778"/>
             </w:tabs>
-            <w:bidi w:val="0"/>
             <w:rPr>
               <w:rFonts w:asciiTheme="minorHAnsi" w:eastAsiaTheme="minorEastAsia" w:hAnsiTheme="minorHAnsi" w:cstheme="minorBidi"/>
               <w:noProof/>
@@ -635,7 +628,6 @@
             <w:tabs>
               <w:tab w:val="right" w:leader="dot" w:pos="8778"/>
             </w:tabs>
-            <w:bidi w:val="0"/>
             <w:rPr>
               <w:rFonts w:asciiTheme="minorHAnsi" w:eastAsiaTheme="minorEastAsia" w:hAnsiTheme="minorHAnsi" w:cstheme="minorBidi"/>
               <w:noProof/>
@@ -712,7 +704,6 @@
             <w:tabs>
               <w:tab w:val="right" w:leader="dot" w:pos="8778"/>
             </w:tabs>
-            <w:bidi w:val="0"/>
             <w:rPr>
               <w:rFonts w:asciiTheme="minorHAnsi" w:eastAsiaTheme="minorEastAsia" w:hAnsiTheme="minorHAnsi" w:cstheme="minorBidi"/>
               <w:noProof/>
@@ -789,7 +780,6 @@
             <w:tabs>
               <w:tab w:val="right" w:leader="dot" w:pos="8778"/>
             </w:tabs>
-            <w:bidi w:val="0"/>
             <w:rPr>
               <w:rFonts w:asciiTheme="minorHAnsi" w:eastAsiaTheme="minorEastAsia" w:hAnsiTheme="minorHAnsi" w:cstheme="minorBidi"/>
               <w:noProof/>
@@ -866,7 +856,6 @@
             <w:tabs>
               <w:tab w:val="right" w:leader="dot" w:pos="8778"/>
             </w:tabs>
-            <w:bidi w:val="0"/>
             <w:rPr>
               <w:rFonts w:asciiTheme="minorHAnsi" w:eastAsiaTheme="minorEastAsia" w:hAnsiTheme="minorHAnsi" w:cstheme="minorBidi"/>
               <w:noProof/>
@@ -943,7 +932,6 @@
             <w:tabs>
               <w:tab w:val="right" w:leader="dot" w:pos="8778"/>
             </w:tabs>
-            <w:bidi w:val="0"/>
             <w:rPr>
               <w:rFonts w:asciiTheme="minorHAnsi" w:eastAsiaTheme="minorEastAsia" w:hAnsiTheme="minorHAnsi" w:cstheme="minorBidi"/>
               <w:noProof/>
@@ -1020,7 +1008,6 @@
             <w:tabs>
               <w:tab w:val="right" w:leader="dot" w:pos="8778"/>
             </w:tabs>
-            <w:bidi w:val="0"/>
             <w:rPr>
               <w:rFonts w:asciiTheme="minorHAnsi" w:eastAsiaTheme="minorEastAsia" w:hAnsiTheme="minorHAnsi" w:cstheme="minorBidi"/>
               <w:noProof/>
@@ -1097,7 +1084,6 @@
             <w:tabs>
               <w:tab w:val="right" w:leader="dot" w:pos="8778"/>
             </w:tabs>
-            <w:bidi w:val="0"/>
             <w:rPr>
               <w:rFonts w:asciiTheme="minorHAnsi" w:eastAsiaTheme="minorEastAsia" w:hAnsiTheme="minorHAnsi" w:cstheme="minorBidi"/>
               <w:noProof/>
@@ -1174,7 +1160,6 @@
             <w:tabs>
               <w:tab w:val="right" w:leader="dot" w:pos="8778"/>
             </w:tabs>
-            <w:bidi w:val="0"/>
             <w:rPr>
               <w:rFonts w:asciiTheme="minorHAnsi" w:eastAsiaTheme="minorEastAsia" w:hAnsiTheme="minorHAnsi" w:cstheme="minorBidi"/>
               <w:noProof/>
@@ -1251,7 +1236,6 @@
             <w:tabs>
               <w:tab w:val="right" w:leader="dot" w:pos="8778"/>
             </w:tabs>
-            <w:bidi w:val="0"/>
             <w:rPr>
               <w:rFonts w:asciiTheme="minorHAnsi" w:eastAsiaTheme="minorEastAsia" w:hAnsiTheme="minorHAnsi" w:cstheme="minorBidi"/>
               <w:noProof/>
@@ -1328,7 +1312,6 @@
             <w:tabs>
               <w:tab w:val="right" w:leader="dot" w:pos="8778"/>
             </w:tabs>
-            <w:bidi w:val="0"/>
             <w:rPr>
               <w:rFonts w:asciiTheme="minorHAnsi" w:eastAsiaTheme="minorEastAsia" w:hAnsiTheme="minorHAnsi" w:cstheme="minorBidi"/>
               <w:noProof/>
@@ -1405,7 +1388,6 @@
             <w:tabs>
               <w:tab w:val="right" w:leader="dot" w:pos="8778"/>
             </w:tabs>
-            <w:bidi w:val="0"/>
             <w:rPr>
               <w:rFonts w:asciiTheme="minorHAnsi" w:eastAsiaTheme="minorEastAsia" w:hAnsiTheme="minorHAnsi" w:cstheme="minorBidi"/>
               <w:noProof/>
@@ -1482,7 +1464,6 @@
             <w:tabs>
               <w:tab w:val="right" w:leader="dot" w:pos="8778"/>
             </w:tabs>
-            <w:bidi w:val="0"/>
             <w:rPr>
               <w:rFonts w:asciiTheme="minorHAnsi" w:eastAsiaTheme="minorEastAsia" w:hAnsiTheme="minorHAnsi" w:cstheme="minorBidi"/>
               <w:noProof/>
@@ -1559,7 +1540,6 @@
             <w:tabs>
               <w:tab w:val="right" w:leader="dot" w:pos="8778"/>
             </w:tabs>
-            <w:bidi w:val="0"/>
             <w:rPr>
               <w:rFonts w:asciiTheme="minorHAnsi" w:eastAsiaTheme="minorEastAsia" w:hAnsiTheme="minorHAnsi" w:cstheme="minorBidi"/>
               <w:noProof/>
@@ -1636,7 +1616,6 @@
             <w:tabs>
               <w:tab w:val="right" w:leader="dot" w:pos="8778"/>
             </w:tabs>
-            <w:bidi w:val="0"/>
             <w:rPr>
               <w:rFonts w:asciiTheme="minorHAnsi" w:eastAsiaTheme="minorEastAsia" w:hAnsiTheme="minorHAnsi" w:cstheme="minorBidi"/>
               <w:noProof/>
@@ -1713,7 +1692,6 @@
             <w:tabs>
               <w:tab w:val="right" w:leader="dot" w:pos="8778"/>
             </w:tabs>
-            <w:bidi w:val="0"/>
             <w:rPr>
               <w:rFonts w:asciiTheme="minorHAnsi" w:eastAsiaTheme="minorEastAsia" w:hAnsiTheme="minorHAnsi" w:cstheme="minorBidi"/>
               <w:noProof/>
@@ -1790,7 +1768,6 @@
             <w:tabs>
               <w:tab w:val="right" w:leader="dot" w:pos="8778"/>
             </w:tabs>
-            <w:bidi w:val="0"/>
             <w:rPr>
               <w:rFonts w:asciiTheme="minorHAnsi" w:eastAsiaTheme="minorEastAsia" w:hAnsiTheme="minorHAnsi" w:cstheme="minorBidi"/>
               <w:noProof/>
@@ -1867,7 +1844,6 @@
             <w:tabs>
               <w:tab w:val="right" w:leader="dot" w:pos="8778"/>
             </w:tabs>
-            <w:bidi w:val="0"/>
             <w:rPr>
               <w:rFonts w:asciiTheme="minorHAnsi" w:eastAsiaTheme="minorEastAsia" w:hAnsiTheme="minorHAnsi" w:cstheme="minorBidi"/>
               <w:noProof/>
@@ -1944,7 +1920,6 @@
             <w:tabs>
               <w:tab w:val="right" w:leader="dot" w:pos="8778"/>
             </w:tabs>
-            <w:bidi w:val="0"/>
             <w:rPr>
               <w:rFonts w:asciiTheme="minorHAnsi" w:eastAsiaTheme="minorEastAsia" w:hAnsiTheme="minorHAnsi" w:cstheme="minorBidi"/>
               <w:noProof/>
@@ -2021,7 +1996,6 @@
             <w:tabs>
               <w:tab w:val="right" w:leader="dot" w:pos="8778"/>
             </w:tabs>
-            <w:bidi w:val="0"/>
             <w:rPr>
               <w:rFonts w:asciiTheme="minorHAnsi" w:eastAsiaTheme="minorEastAsia" w:hAnsiTheme="minorHAnsi" w:cstheme="minorBidi"/>
               <w:noProof/>
@@ -2098,7 +2072,6 @@
             <w:tabs>
               <w:tab w:val="right" w:leader="dot" w:pos="8778"/>
             </w:tabs>
-            <w:bidi w:val="0"/>
             <w:rPr>
               <w:rFonts w:asciiTheme="minorHAnsi" w:eastAsiaTheme="minorEastAsia" w:hAnsiTheme="minorHAnsi" w:cstheme="minorBidi"/>
               <w:noProof/>
@@ -2175,7 +2148,6 @@
             <w:tabs>
               <w:tab w:val="right" w:leader="dot" w:pos="8778"/>
             </w:tabs>
-            <w:bidi w:val="0"/>
             <w:rPr>
               <w:rFonts w:asciiTheme="minorHAnsi" w:eastAsiaTheme="minorEastAsia" w:hAnsiTheme="minorHAnsi" w:cstheme="minorBidi"/>
               <w:noProof/>
@@ -2252,7 +2224,6 @@
             <w:tabs>
               <w:tab w:val="right" w:leader="dot" w:pos="8778"/>
             </w:tabs>
-            <w:bidi w:val="0"/>
             <w:rPr>
               <w:rFonts w:asciiTheme="minorHAnsi" w:eastAsiaTheme="minorEastAsia" w:hAnsiTheme="minorHAnsi" w:cstheme="minorBidi"/>
               <w:noProof/>
@@ -2329,7 +2300,6 @@
             <w:tabs>
               <w:tab w:val="right" w:leader="dot" w:pos="8778"/>
             </w:tabs>
-            <w:bidi w:val="0"/>
             <w:rPr>
               <w:rFonts w:asciiTheme="minorHAnsi" w:eastAsiaTheme="minorEastAsia" w:hAnsiTheme="minorHAnsi" w:cstheme="minorBidi"/>
               <w:noProof/>
@@ -2406,7 +2376,6 @@
             <w:tabs>
               <w:tab w:val="right" w:leader="dot" w:pos="8778"/>
             </w:tabs>
-            <w:bidi w:val="0"/>
             <w:rPr>
               <w:rFonts w:asciiTheme="minorHAnsi" w:eastAsiaTheme="minorEastAsia" w:hAnsiTheme="minorHAnsi" w:cstheme="minorBidi"/>
               <w:noProof/>
@@ -2483,7 +2452,6 @@
             <w:tabs>
               <w:tab w:val="right" w:leader="dot" w:pos="8778"/>
             </w:tabs>
-            <w:bidi w:val="0"/>
             <w:rPr>
               <w:rFonts w:asciiTheme="minorHAnsi" w:eastAsiaTheme="minorEastAsia" w:hAnsiTheme="minorHAnsi" w:cstheme="minorBidi"/>
               <w:noProof/>
@@ -2560,7 +2528,6 @@
             <w:tabs>
               <w:tab w:val="right" w:leader="dot" w:pos="8778"/>
             </w:tabs>
-            <w:bidi w:val="0"/>
             <w:rPr>
               <w:rFonts w:asciiTheme="minorHAnsi" w:eastAsiaTheme="minorEastAsia" w:hAnsiTheme="minorHAnsi" w:cstheme="minorBidi"/>
               <w:noProof/>
@@ -2637,7 +2604,6 @@
             <w:tabs>
               <w:tab w:val="right" w:leader="dot" w:pos="8778"/>
             </w:tabs>
-            <w:bidi w:val="0"/>
             <w:rPr>
               <w:rFonts w:asciiTheme="minorHAnsi" w:eastAsiaTheme="minorEastAsia" w:hAnsiTheme="minorHAnsi" w:cstheme="minorBidi"/>
               <w:noProof/>
@@ -2714,7 +2680,6 @@
             <w:tabs>
               <w:tab w:val="right" w:leader="dot" w:pos="8778"/>
             </w:tabs>
-            <w:bidi w:val="0"/>
             <w:rPr>
               <w:rFonts w:asciiTheme="minorHAnsi" w:eastAsiaTheme="minorEastAsia" w:hAnsiTheme="minorHAnsi" w:cstheme="minorBidi"/>
               <w:noProof/>
@@ -2791,7 +2756,6 @@
             <w:tabs>
               <w:tab w:val="right" w:leader="dot" w:pos="8778"/>
             </w:tabs>
-            <w:bidi w:val="0"/>
             <w:rPr>
               <w:rFonts w:asciiTheme="minorHAnsi" w:eastAsiaTheme="minorEastAsia" w:hAnsiTheme="minorHAnsi" w:cstheme="minorBidi"/>
               <w:noProof/>
@@ -2868,7 +2832,6 @@
             <w:tabs>
               <w:tab w:val="right" w:leader="dot" w:pos="8778"/>
             </w:tabs>
-            <w:bidi w:val="0"/>
             <w:rPr>
               <w:rFonts w:asciiTheme="minorHAnsi" w:eastAsiaTheme="minorEastAsia" w:hAnsiTheme="minorHAnsi" w:cstheme="minorBidi"/>
               <w:noProof/>
@@ -2945,7 +2908,6 @@
             <w:tabs>
               <w:tab w:val="right" w:leader="dot" w:pos="8778"/>
             </w:tabs>
-            <w:bidi w:val="0"/>
             <w:rPr>
               <w:rFonts w:asciiTheme="minorHAnsi" w:eastAsiaTheme="minorEastAsia" w:hAnsiTheme="minorHAnsi" w:cstheme="minorBidi"/>
               <w:noProof/>
@@ -3022,7 +2984,6 @@
             <w:tabs>
               <w:tab w:val="right" w:leader="dot" w:pos="8778"/>
             </w:tabs>
-            <w:bidi w:val="0"/>
             <w:rPr>
               <w:rFonts w:asciiTheme="minorHAnsi" w:eastAsiaTheme="minorEastAsia" w:hAnsiTheme="minorHAnsi" w:cstheme="minorBidi"/>
               <w:noProof/>
@@ -3099,7 +3060,6 @@
             <w:tabs>
               <w:tab w:val="right" w:leader="dot" w:pos="8778"/>
             </w:tabs>
-            <w:bidi w:val="0"/>
             <w:rPr>
               <w:rFonts w:asciiTheme="minorHAnsi" w:eastAsiaTheme="minorEastAsia" w:hAnsiTheme="minorHAnsi" w:cstheme="minorBidi"/>
               <w:noProof/>
@@ -3176,7 +3136,6 @@
             <w:tabs>
               <w:tab w:val="right" w:leader="dot" w:pos="8778"/>
             </w:tabs>
-            <w:bidi w:val="0"/>
             <w:rPr>
               <w:rFonts w:asciiTheme="minorHAnsi" w:eastAsiaTheme="minorEastAsia" w:hAnsiTheme="minorHAnsi" w:cstheme="minorBidi"/>
               <w:noProof/>
@@ -3253,7 +3212,6 @@
             <w:tabs>
               <w:tab w:val="right" w:leader="dot" w:pos="8778"/>
             </w:tabs>
-            <w:bidi w:val="0"/>
             <w:rPr>
               <w:rFonts w:asciiTheme="minorHAnsi" w:eastAsiaTheme="minorEastAsia" w:hAnsiTheme="minorHAnsi" w:cstheme="minorBidi"/>
               <w:noProof/>
@@ -3330,7 +3288,6 @@
             <w:tabs>
               <w:tab w:val="right" w:leader="dot" w:pos="8778"/>
             </w:tabs>
-            <w:bidi w:val="0"/>
             <w:rPr>
               <w:rFonts w:asciiTheme="minorHAnsi" w:eastAsiaTheme="minorEastAsia" w:hAnsiTheme="minorHAnsi" w:cstheme="minorBidi"/>
               <w:noProof/>
@@ -3407,7 +3364,6 @@
             <w:tabs>
               <w:tab w:val="right" w:leader="dot" w:pos="8778"/>
             </w:tabs>
-            <w:bidi w:val="0"/>
             <w:rPr>
               <w:rFonts w:asciiTheme="minorHAnsi" w:eastAsiaTheme="minorEastAsia" w:hAnsiTheme="minorHAnsi" w:cstheme="minorBidi"/>
               <w:noProof/>
@@ -3484,7 +3440,6 @@
             <w:tabs>
               <w:tab w:val="right" w:leader="dot" w:pos="8778"/>
             </w:tabs>
-            <w:bidi w:val="0"/>
             <w:rPr>
               <w:rFonts w:asciiTheme="minorHAnsi" w:eastAsiaTheme="minorEastAsia" w:hAnsiTheme="minorHAnsi" w:cstheme="minorBidi"/>
               <w:noProof/>
@@ -3561,7 +3516,6 @@
             <w:tabs>
               <w:tab w:val="right" w:leader="dot" w:pos="8778"/>
             </w:tabs>
-            <w:bidi w:val="0"/>
             <w:rPr>
               <w:rFonts w:asciiTheme="minorHAnsi" w:eastAsiaTheme="minorEastAsia" w:hAnsiTheme="minorHAnsi" w:cstheme="minorBidi"/>
               <w:noProof/>
@@ -3638,7 +3592,6 @@
             <w:tabs>
               <w:tab w:val="right" w:leader="dot" w:pos="8778"/>
             </w:tabs>
-            <w:bidi w:val="0"/>
             <w:rPr>
               <w:rFonts w:asciiTheme="minorHAnsi" w:eastAsiaTheme="minorEastAsia" w:hAnsiTheme="minorHAnsi" w:cstheme="minorBidi"/>
               <w:noProof/>
@@ -3715,7 +3668,6 @@
             <w:tabs>
               <w:tab w:val="right" w:leader="dot" w:pos="8778"/>
             </w:tabs>
-            <w:bidi w:val="0"/>
             <w:rPr>
               <w:rFonts w:asciiTheme="minorHAnsi" w:eastAsiaTheme="minorEastAsia" w:hAnsiTheme="minorHAnsi" w:cstheme="minorBidi"/>
               <w:noProof/>
@@ -3792,7 +3744,6 @@
             <w:tabs>
               <w:tab w:val="right" w:leader="dot" w:pos="8778"/>
             </w:tabs>
-            <w:bidi w:val="0"/>
             <w:rPr>
               <w:rFonts w:asciiTheme="minorHAnsi" w:eastAsiaTheme="minorEastAsia" w:hAnsiTheme="minorHAnsi" w:cstheme="minorBidi"/>
               <w:noProof/>
@@ -3869,7 +3820,6 @@
             <w:tabs>
               <w:tab w:val="right" w:leader="dot" w:pos="8778"/>
             </w:tabs>
-            <w:bidi w:val="0"/>
             <w:rPr>
               <w:rFonts w:asciiTheme="minorHAnsi" w:eastAsiaTheme="minorEastAsia" w:hAnsiTheme="minorHAnsi" w:cstheme="minorBidi"/>
               <w:noProof/>
@@ -3946,7 +3896,6 @@
             <w:tabs>
               <w:tab w:val="right" w:leader="dot" w:pos="8778"/>
             </w:tabs>
-            <w:bidi w:val="0"/>
             <w:rPr>
               <w:rFonts w:asciiTheme="minorHAnsi" w:eastAsiaTheme="minorEastAsia" w:hAnsiTheme="minorHAnsi" w:cstheme="minorBidi"/>
               <w:noProof/>
@@ -4023,7 +3972,6 @@
             <w:tabs>
               <w:tab w:val="right" w:leader="dot" w:pos="8778"/>
             </w:tabs>
-            <w:bidi w:val="0"/>
             <w:rPr>
               <w:rFonts w:asciiTheme="minorHAnsi" w:eastAsiaTheme="minorEastAsia" w:hAnsiTheme="minorHAnsi" w:cstheme="minorBidi"/>
               <w:noProof/>
@@ -4100,7 +4048,6 @@
             <w:tabs>
               <w:tab w:val="right" w:leader="dot" w:pos="8778"/>
             </w:tabs>
-            <w:bidi w:val="0"/>
             <w:rPr>
               <w:rFonts w:asciiTheme="minorHAnsi" w:eastAsiaTheme="minorEastAsia" w:hAnsiTheme="minorHAnsi" w:cstheme="minorBidi"/>
               <w:noProof/>
@@ -4177,7 +4124,6 @@
             <w:tabs>
               <w:tab w:val="right" w:leader="dot" w:pos="8778"/>
             </w:tabs>
-            <w:bidi w:val="0"/>
             <w:rPr>
               <w:rFonts w:asciiTheme="minorHAnsi" w:eastAsiaTheme="minorEastAsia" w:hAnsiTheme="minorHAnsi" w:cstheme="minorBidi"/>
               <w:noProof/>
@@ -4254,7 +4200,6 @@
             <w:tabs>
               <w:tab w:val="right" w:leader="dot" w:pos="8778"/>
             </w:tabs>
-            <w:bidi w:val="0"/>
             <w:rPr>
               <w:rFonts w:asciiTheme="minorHAnsi" w:eastAsiaTheme="minorEastAsia" w:hAnsiTheme="minorHAnsi" w:cstheme="minorBidi"/>
               <w:noProof/>
@@ -4331,7 +4276,6 @@
             <w:tabs>
               <w:tab w:val="right" w:leader="dot" w:pos="8778"/>
             </w:tabs>
-            <w:bidi w:val="0"/>
             <w:rPr>
               <w:rFonts w:asciiTheme="minorHAnsi" w:eastAsiaTheme="minorEastAsia" w:hAnsiTheme="minorHAnsi" w:cstheme="minorBidi"/>
               <w:noProof/>
@@ -4408,7 +4352,6 @@
             <w:tabs>
               <w:tab w:val="right" w:leader="dot" w:pos="8778"/>
             </w:tabs>
-            <w:bidi w:val="0"/>
             <w:rPr>
               <w:rFonts w:asciiTheme="minorHAnsi" w:eastAsiaTheme="minorEastAsia" w:hAnsiTheme="minorHAnsi" w:cstheme="minorBidi"/>
               <w:noProof/>
@@ -4485,7 +4428,6 @@
             <w:tabs>
               <w:tab w:val="right" w:leader="dot" w:pos="8778"/>
             </w:tabs>
-            <w:bidi w:val="0"/>
             <w:rPr>
               <w:rFonts w:asciiTheme="minorHAnsi" w:eastAsiaTheme="minorEastAsia" w:hAnsiTheme="minorHAnsi" w:cstheme="minorBidi"/>
               <w:noProof/>
@@ -4562,7 +4504,6 @@
             <w:tabs>
               <w:tab w:val="right" w:leader="dot" w:pos="8778"/>
             </w:tabs>
-            <w:bidi w:val="0"/>
             <w:rPr>
               <w:rFonts w:asciiTheme="minorHAnsi" w:eastAsiaTheme="minorEastAsia" w:hAnsiTheme="minorHAnsi" w:cstheme="minorBidi"/>
               <w:noProof/>
@@ -4639,7 +4580,6 @@
             <w:tabs>
               <w:tab w:val="right" w:leader="dot" w:pos="8778"/>
             </w:tabs>
-            <w:bidi w:val="0"/>
             <w:rPr>
               <w:rFonts w:asciiTheme="minorHAnsi" w:eastAsiaTheme="minorEastAsia" w:hAnsiTheme="minorHAnsi" w:cstheme="minorBidi"/>
               <w:noProof/>
@@ -4716,7 +4656,6 @@
             <w:tabs>
               <w:tab w:val="right" w:leader="dot" w:pos="8778"/>
             </w:tabs>
-            <w:bidi w:val="0"/>
             <w:rPr>
               <w:rFonts w:asciiTheme="minorHAnsi" w:eastAsiaTheme="minorEastAsia" w:hAnsiTheme="minorHAnsi" w:cstheme="minorBidi"/>
               <w:noProof/>
@@ -4793,7 +4732,6 @@
             <w:tabs>
               <w:tab w:val="right" w:leader="dot" w:pos="8778"/>
             </w:tabs>
-            <w:bidi w:val="0"/>
             <w:rPr>
               <w:rFonts w:asciiTheme="minorHAnsi" w:eastAsiaTheme="minorEastAsia" w:hAnsiTheme="minorHAnsi" w:cstheme="minorBidi"/>
               <w:noProof/>
@@ -4870,7 +4808,6 @@
             <w:tabs>
               <w:tab w:val="right" w:leader="dot" w:pos="8778"/>
             </w:tabs>
-            <w:bidi w:val="0"/>
             <w:rPr>
               <w:rFonts w:asciiTheme="minorHAnsi" w:eastAsiaTheme="minorEastAsia" w:hAnsiTheme="minorHAnsi" w:cstheme="minorBidi"/>
               <w:noProof/>
@@ -4947,7 +4884,6 @@
             <w:tabs>
               <w:tab w:val="right" w:leader="dot" w:pos="8778"/>
             </w:tabs>
-            <w:bidi w:val="0"/>
             <w:rPr>
               <w:rFonts w:asciiTheme="minorHAnsi" w:eastAsiaTheme="minorEastAsia" w:hAnsiTheme="minorHAnsi" w:cstheme="minorBidi"/>
               <w:noProof/>
@@ -5024,7 +4960,6 @@
             <w:tabs>
               <w:tab w:val="right" w:leader="dot" w:pos="8778"/>
             </w:tabs>
-            <w:bidi w:val="0"/>
             <w:rPr>
               <w:rFonts w:asciiTheme="minorHAnsi" w:eastAsiaTheme="minorEastAsia" w:hAnsiTheme="minorHAnsi" w:cstheme="minorBidi"/>
               <w:noProof/>
@@ -5101,7 +5036,6 @@
             <w:tabs>
               <w:tab w:val="right" w:leader="dot" w:pos="8778"/>
             </w:tabs>
-            <w:bidi w:val="0"/>
             <w:rPr>
               <w:rFonts w:asciiTheme="minorHAnsi" w:eastAsiaTheme="minorEastAsia" w:hAnsiTheme="minorHAnsi" w:cstheme="minorBidi"/>
               <w:noProof/>
@@ -5178,7 +5112,6 @@
             <w:tabs>
               <w:tab w:val="right" w:leader="dot" w:pos="8778"/>
             </w:tabs>
-            <w:bidi w:val="0"/>
             <w:rPr>
               <w:rFonts w:asciiTheme="minorHAnsi" w:eastAsiaTheme="minorEastAsia" w:hAnsiTheme="minorHAnsi" w:cstheme="minorBidi"/>
               <w:noProof/>
@@ -5255,7 +5188,6 @@
             <w:tabs>
               <w:tab w:val="right" w:leader="dot" w:pos="8778"/>
             </w:tabs>
-            <w:bidi w:val="0"/>
             <w:rPr>
               <w:rFonts w:asciiTheme="minorHAnsi" w:eastAsiaTheme="minorEastAsia" w:hAnsiTheme="minorHAnsi" w:cstheme="minorBidi"/>
               <w:noProof/>
@@ -5393,12 +5325,6 @@
         <w:gridCol w:w="1230"/>
       </w:tblGrid>
       <w:tr>
-        <w:tblPrEx>
-          <w:tblCellMar>
-            <w:top w:w="0" w:type="dxa"/>
-            <w:bottom w:w="0" w:type="dxa"/>
-          </w:tblCellMar>
-        </w:tblPrEx>
         <w:trPr>
           <w:cantSplit/>
         </w:trPr>
@@ -5465,12 +5391,6 @@
         </w:tc>
       </w:tr>
       <w:tr>
-        <w:tblPrEx>
-          <w:tblCellMar>
-            <w:top w:w="0" w:type="dxa"/>
-            <w:bottom w:w="0" w:type="dxa"/>
-          </w:tblCellMar>
-        </w:tblPrEx>
         <w:trPr>
           <w:cantSplit/>
         </w:trPr>
@@ -5537,12 +5457,6 @@
         </w:tc>
       </w:tr>
       <w:tr>
-        <w:tblPrEx>
-          <w:tblCellMar>
-            <w:top w:w="0" w:type="dxa"/>
-            <w:bottom w:w="0" w:type="dxa"/>
-          </w:tblCellMar>
-        </w:tblPrEx>
         <w:trPr>
           <w:cantSplit/>
         </w:trPr>
@@ -5609,12 +5523,6 @@
         </w:tc>
       </w:tr>
       <w:tr>
-        <w:tblPrEx>
-          <w:tblCellMar>
-            <w:top w:w="0" w:type="dxa"/>
-            <w:bottom w:w="0" w:type="dxa"/>
-          </w:tblCellMar>
-        </w:tblPrEx>
         <w:trPr>
           <w:cantSplit/>
         </w:trPr>
@@ -5681,12 +5589,6 @@
         </w:tc>
       </w:tr>
       <w:tr>
-        <w:tblPrEx>
-          <w:tblCellMar>
-            <w:top w:w="0" w:type="dxa"/>
-            <w:bottom w:w="0" w:type="dxa"/>
-          </w:tblCellMar>
-        </w:tblPrEx>
         <w:trPr>
           <w:cantSplit/>
         </w:trPr>
@@ -5753,12 +5655,6 @@
         </w:tc>
       </w:tr>
       <w:tr>
-        <w:tblPrEx>
-          <w:tblCellMar>
-            <w:top w:w="0" w:type="dxa"/>
-            <w:bottom w:w="0" w:type="dxa"/>
-          </w:tblCellMar>
-        </w:tblPrEx>
         <w:trPr>
           <w:cantSplit/>
         </w:trPr>
@@ -5870,12 +5766,6 @@
         <w:gridCol w:w="1230"/>
       </w:tblGrid>
       <w:tr>
-        <w:tblPrEx>
-          <w:tblCellMar>
-            <w:top w:w="0" w:type="dxa"/>
-            <w:bottom w:w="0" w:type="dxa"/>
-          </w:tblCellMar>
-        </w:tblPrEx>
         <w:trPr>
           <w:cantSplit/>
         </w:trPr>
@@ -5942,12 +5832,6 @@
         </w:tc>
       </w:tr>
       <w:tr>
-        <w:tblPrEx>
-          <w:tblCellMar>
-            <w:top w:w="0" w:type="dxa"/>
-            <w:bottom w:w="0" w:type="dxa"/>
-          </w:tblCellMar>
-        </w:tblPrEx>
         <w:trPr>
           <w:cantSplit/>
         </w:trPr>
@@ -6014,12 +5898,6 @@
         </w:tc>
       </w:tr>
       <w:tr>
-        <w:tblPrEx>
-          <w:tblCellMar>
-            <w:top w:w="0" w:type="dxa"/>
-            <w:bottom w:w="0" w:type="dxa"/>
-          </w:tblCellMar>
-        </w:tblPrEx>
         <w:trPr>
           <w:cantSplit/>
         </w:trPr>
@@ -6086,12 +5964,6 @@
         </w:tc>
       </w:tr>
       <w:tr>
-        <w:tblPrEx>
-          <w:tblCellMar>
-            <w:top w:w="0" w:type="dxa"/>
-            <w:bottom w:w="0" w:type="dxa"/>
-          </w:tblCellMar>
-        </w:tblPrEx>
         <w:trPr>
           <w:cantSplit/>
         </w:trPr>
@@ -6158,12 +6030,6 @@
         </w:tc>
       </w:tr>
       <w:tr>
-        <w:tblPrEx>
-          <w:tblCellMar>
-            <w:top w:w="0" w:type="dxa"/>
-            <w:bottom w:w="0" w:type="dxa"/>
-          </w:tblCellMar>
-        </w:tblPrEx>
         <w:trPr>
           <w:cantSplit/>
         </w:trPr>
@@ -6230,12 +6096,6 @@
         </w:tc>
       </w:tr>
       <w:tr>
-        <w:tblPrEx>
-          <w:tblCellMar>
-            <w:top w:w="0" w:type="dxa"/>
-            <w:bottom w:w="0" w:type="dxa"/>
-          </w:tblCellMar>
-        </w:tblPrEx>
         <w:trPr>
           <w:cantSplit/>
         </w:trPr>
@@ -6302,12 +6162,6 @@
         </w:tc>
       </w:tr>
       <w:tr>
-        <w:tblPrEx>
-          <w:tblCellMar>
-            <w:top w:w="0" w:type="dxa"/>
-            <w:bottom w:w="0" w:type="dxa"/>
-          </w:tblCellMar>
-        </w:tblPrEx>
         <w:trPr>
           <w:cantSplit/>
         </w:trPr>
@@ -6374,12 +6228,6 @@
         </w:tc>
       </w:tr>
       <w:tr>
-        <w:tblPrEx>
-          <w:tblCellMar>
-            <w:top w:w="0" w:type="dxa"/>
-            <w:bottom w:w="0" w:type="dxa"/>
-          </w:tblCellMar>
-        </w:tblPrEx>
         <w:trPr>
           <w:cantSplit/>
         </w:trPr>
@@ -6446,12 +6294,6 @@
         </w:tc>
       </w:tr>
       <w:tr>
-        <w:tblPrEx>
-          <w:tblCellMar>
-            <w:top w:w="0" w:type="dxa"/>
-            <w:bottom w:w="0" w:type="dxa"/>
-          </w:tblCellMar>
-        </w:tblPrEx>
         <w:trPr>
           <w:cantSplit/>
         </w:trPr>
@@ -6518,12 +6360,6 @@
         </w:tc>
       </w:tr>
       <w:tr>
-        <w:tblPrEx>
-          <w:tblCellMar>
-            <w:top w:w="0" w:type="dxa"/>
-            <w:bottom w:w="0" w:type="dxa"/>
-          </w:tblCellMar>
-        </w:tblPrEx>
         <w:trPr>
           <w:cantSplit/>
         </w:trPr>
@@ -6590,12 +6426,6 @@
         </w:tc>
       </w:tr>
       <w:tr>
-        <w:tblPrEx>
-          <w:tblCellMar>
-            <w:top w:w="0" w:type="dxa"/>
-            <w:bottom w:w="0" w:type="dxa"/>
-          </w:tblCellMar>
-        </w:tblPrEx>
         <w:trPr>
           <w:cantSplit/>
         </w:trPr>
@@ -7390,12 +7220,6 @@
         <w:gridCol w:w="5449"/>
       </w:tblGrid>
       <w:tr>
-        <w:tblPrEx>
-          <w:tblCellMar>
-            <w:top w:w="0" w:type="dxa"/>
-            <w:bottom w:w="0" w:type="dxa"/>
-          </w:tblCellMar>
-        </w:tblPrEx>
         <w:trPr>
           <w:cantSplit/>
           <w:tblHeader/>
@@ -7504,12 +7328,6 @@
         </w:tc>
       </w:tr>
       <w:tr>
-        <w:tblPrEx>
-          <w:tblCellMar>
-            <w:top w:w="0" w:type="dxa"/>
-            <w:bottom w:w="0" w:type="dxa"/>
-          </w:tblCellMar>
-        </w:tblPrEx>
         <w:trPr>
           <w:cantSplit/>
         </w:trPr>
@@ -7611,12 +7429,6 @@
         </w:tc>
       </w:tr>
       <w:tr>
-        <w:tblPrEx>
-          <w:tblCellMar>
-            <w:top w:w="0" w:type="dxa"/>
-            <w:bottom w:w="0" w:type="dxa"/>
-          </w:tblCellMar>
-        </w:tblPrEx>
         <w:trPr>
           <w:cantSplit/>
         </w:trPr>
@@ -7718,12 +7530,6 @@
         </w:tc>
       </w:tr>
       <w:tr>
-        <w:tblPrEx>
-          <w:tblCellMar>
-            <w:top w:w="0" w:type="dxa"/>
-            <w:bottom w:w="0" w:type="dxa"/>
-          </w:tblCellMar>
-        </w:tblPrEx>
         <w:trPr>
           <w:cantSplit/>
         </w:trPr>
@@ -7825,12 +7631,6 @@
         </w:tc>
       </w:tr>
       <w:tr>
-        <w:tblPrEx>
-          <w:tblCellMar>
-            <w:top w:w="0" w:type="dxa"/>
-            <w:bottom w:w="0" w:type="dxa"/>
-          </w:tblCellMar>
-        </w:tblPrEx>
         <w:trPr>
           <w:cantSplit/>
         </w:trPr>
@@ -7932,12 +7732,6 @@
         </w:tc>
       </w:tr>
       <w:tr>
-        <w:tblPrEx>
-          <w:tblCellMar>
-            <w:top w:w="0" w:type="dxa"/>
-            <w:bottom w:w="0" w:type="dxa"/>
-          </w:tblCellMar>
-        </w:tblPrEx>
         <w:trPr>
           <w:cantSplit/>
         </w:trPr>
@@ -8039,12 +7833,6 @@
         </w:tc>
       </w:tr>
       <w:tr>
-        <w:tblPrEx>
-          <w:tblCellMar>
-            <w:top w:w="0" w:type="dxa"/>
-            <w:bottom w:w="0" w:type="dxa"/>
-          </w:tblCellMar>
-        </w:tblPrEx>
         <w:trPr>
           <w:cantSplit/>
         </w:trPr>
@@ -8146,12 +7934,6 @@
         </w:tc>
       </w:tr>
       <w:tr>
-        <w:tblPrEx>
-          <w:tblCellMar>
-            <w:top w:w="0" w:type="dxa"/>
-            <w:bottom w:w="0" w:type="dxa"/>
-          </w:tblCellMar>
-        </w:tblPrEx>
         <w:trPr>
           <w:cantSplit/>
         </w:trPr>
@@ -8253,12 +8035,6 @@
         </w:tc>
       </w:tr>
       <w:tr>
-        <w:tblPrEx>
-          <w:tblCellMar>
-            <w:top w:w="0" w:type="dxa"/>
-            <w:bottom w:w="0" w:type="dxa"/>
-          </w:tblCellMar>
-        </w:tblPrEx>
         <w:trPr>
           <w:cantSplit/>
         </w:trPr>
@@ -8360,12 +8136,6 @@
         </w:tc>
       </w:tr>
       <w:tr>
-        <w:tblPrEx>
-          <w:tblCellMar>
-            <w:top w:w="0" w:type="dxa"/>
-            <w:bottom w:w="0" w:type="dxa"/>
-          </w:tblCellMar>
-        </w:tblPrEx>
         <w:trPr>
           <w:cantSplit/>
         </w:trPr>
@@ -8467,12 +8237,6 @@
         </w:tc>
       </w:tr>
       <w:tr>
-        <w:tblPrEx>
-          <w:tblCellMar>
-            <w:top w:w="0" w:type="dxa"/>
-            <w:bottom w:w="0" w:type="dxa"/>
-          </w:tblCellMar>
-        </w:tblPrEx>
         <w:trPr>
           <w:cantSplit/>
         </w:trPr>
@@ -8649,12 +8413,6 @@
         <w:gridCol w:w="5449"/>
       </w:tblGrid>
       <w:tr>
-        <w:tblPrEx>
-          <w:tblCellMar>
-            <w:top w:w="0" w:type="dxa"/>
-            <w:bottom w:w="0" w:type="dxa"/>
-          </w:tblCellMar>
-        </w:tblPrEx>
         <w:trPr>
           <w:cantSplit/>
           <w:tblHeader/>
@@ -8763,12 +8521,6 @@
         </w:tc>
       </w:tr>
       <w:tr>
-        <w:tblPrEx>
-          <w:tblCellMar>
-            <w:top w:w="0" w:type="dxa"/>
-            <w:bottom w:w="0" w:type="dxa"/>
-          </w:tblCellMar>
-        </w:tblPrEx>
         <w:trPr>
           <w:cantSplit/>
         </w:trPr>
@@ -8870,12 +8622,6 @@
         </w:tc>
       </w:tr>
       <w:tr>
-        <w:tblPrEx>
-          <w:tblCellMar>
-            <w:top w:w="0" w:type="dxa"/>
-            <w:bottom w:w="0" w:type="dxa"/>
-          </w:tblCellMar>
-        </w:tblPrEx>
         <w:trPr>
           <w:cantSplit/>
         </w:trPr>
@@ -8977,12 +8723,6 @@
         </w:tc>
       </w:tr>
       <w:tr>
-        <w:tblPrEx>
-          <w:tblCellMar>
-            <w:top w:w="0" w:type="dxa"/>
-            <w:bottom w:w="0" w:type="dxa"/>
-          </w:tblCellMar>
-        </w:tblPrEx>
         <w:trPr>
           <w:cantSplit/>
         </w:trPr>
@@ -9084,12 +8824,6 @@
         </w:tc>
       </w:tr>
       <w:tr>
-        <w:tblPrEx>
-          <w:tblCellMar>
-            <w:top w:w="0" w:type="dxa"/>
-            <w:bottom w:w="0" w:type="dxa"/>
-          </w:tblCellMar>
-        </w:tblPrEx>
         <w:trPr>
           <w:cantSplit/>
         </w:trPr>
@@ -9191,12 +8925,6 @@
         </w:tc>
       </w:tr>
       <w:tr>
-        <w:tblPrEx>
-          <w:tblCellMar>
-            <w:top w:w="0" w:type="dxa"/>
-            <w:bottom w:w="0" w:type="dxa"/>
-          </w:tblCellMar>
-        </w:tblPrEx>
         <w:trPr>
           <w:cantSplit/>
         </w:trPr>
@@ -9298,12 +9026,6 @@
         </w:tc>
       </w:tr>
       <w:tr>
-        <w:tblPrEx>
-          <w:tblCellMar>
-            <w:top w:w="0" w:type="dxa"/>
-            <w:bottom w:w="0" w:type="dxa"/>
-          </w:tblCellMar>
-        </w:tblPrEx>
         <w:trPr>
           <w:cantSplit/>
         </w:trPr>
@@ -9405,12 +9127,6 @@
         </w:tc>
       </w:tr>
       <w:tr>
-        <w:tblPrEx>
-          <w:tblCellMar>
-            <w:top w:w="0" w:type="dxa"/>
-            <w:bottom w:w="0" w:type="dxa"/>
-          </w:tblCellMar>
-        </w:tblPrEx>
         <w:trPr>
           <w:cantSplit/>
         </w:trPr>
@@ -9751,12 +9467,6 @@
         <w:gridCol w:w="4746"/>
       </w:tblGrid>
       <w:tr>
-        <w:tblPrEx>
-          <w:tblCellMar>
-            <w:top w:w="0" w:type="dxa"/>
-            <w:bottom w:w="0" w:type="dxa"/>
-          </w:tblCellMar>
-        </w:tblPrEx>
         <w:trPr>
           <w:cantSplit/>
           <w:tblHeader/>
@@ -9865,12 +9575,6 @@
         </w:tc>
       </w:tr>
       <w:tr>
-        <w:tblPrEx>
-          <w:tblCellMar>
-            <w:top w:w="0" w:type="dxa"/>
-            <w:bottom w:w="0" w:type="dxa"/>
-          </w:tblCellMar>
-        </w:tblPrEx>
         <w:trPr>
           <w:cantSplit/>
         </w:trPr>
@@ -9972,12 +9676,6 @@
         </w:tc>
       </w:tr>
       <w:tr>
-        <w:tblPrEx>
-          <w:tblCellMar>
-            <w:top w:w="0" w:type="dxa"/>
-            <w:bottom w:w="0" w:type="dxa"/>
-          </w:tblCellMar>
-        </w:tblPrEx>
         <w:trPr>
           <w:cantSplit/>
         </w:trPr>
@@ -10079,12 +9777,6 @@
         </w:tc>
       </w:tr>
       <w:tr>
-        <w:tblPrEx>
-          <w:tblCellMar>
-            <w:top w:w="0" w:type="dxa"/>
-            <w:bottom w:w="0" w:type="dxa"/>
-          </w:tblCellMar>
-        </w:tblPrEx>
         <w:trPr>
           <w:cantSplit/>
         </w:trPr>
@@ -10186,12 +9878,6 @@
         </w:tc>
       </w:tr>
       <w:tr>
-        <w:tblPrEx>
-          <w:tblCellMar>
-            <w:top w:w="0" w:type="dxa"/>
-            <w:bottom w:w="0" w:type="dxa"/>
-          </w:tblCellMar>
-        </w:tblPrEx>
         <w:trPr>
           <w:cantSplit/>
         </w:trPr>
@@ -10293,12 +9979,6 @@
         </w:tc>
       </w:tr>
       <w:tr>
-        <w:tblPrEx>
-          <w:tblCellMar>
-            <w:top w:w="0" w:type="dxa"/>
-            <w:bottom w:w="0" w:type="dxa"/>
-          </w:tblCellMar>
-        </w:tblPrEx>
         <w:trPr>
           <w:cantSplit/>
         </w:trPr>
@@ -10400,12 +10080,6 @@
         </w:tc>
       </w:tr>
       <w:tr>
-        <w:tblPrEx>
-          <w:tblCellMar>
-            <w:top w:w="0" w:type="dxa"/>
-            <w:bottom w:w="0" w:type="dxa"/>
-          </w:tblCellMar>
-        </w:tblPrEx>
         <w:trPr>
           <w:cantSplit/>
         </w:trPr>
@@ -10507,12 +10181,6 @@
         </w:tc>
       </w:tr>
       <w:tr>
-        <w:tblPrEx>
-          <w:tblCellMar>
-            <w:top w:w="0" w:type="dxa"/>
-            <w:bottom w:w="0" w:type="dxa"/>
-          </w:tblCellMar>
-        </w:tblPrEx>
         <w:trPr>
           <w:cantSplit/>
         </w:trPr>
@@ -10614,12 +10282,6 @@
         </w:tc>
       </w:tr>
       <w:tr>
-        <w:tblPrEx>
-          <w:tblCellMar>
-            <w:top w:w="0" w:type="dxa"/>
-            <w:bottom w:w="0" w:type="dxa"/>
-          </w:tblCellMar>
-        </w:tblPrEx>
         <w:trPr>
           <w:cantSplit/>
         </w:trPr>
@@ -10721,12 +10383,6 @@
         </w:tc>
       </w:tr>
       <w:tr>
-        <w:tblPrEx>
-          <w:tblCellMar>
-            <w:top w:w="0" w:type="dxa"/>
-            <w:bottom w:w="0" w:type="dxa"/>
-          </w:tblCellMar>
-        </w:tblPrEx>
         <w:trPr>
           <w:cantSplit/>
         </w:trPr>
@@ -10916,12 +10572,6 @@
         <w:gridCol w:w="5624"/>
       </w:tblGrid>
       <w:tr>
-        <w:tblPrEx>
-          <w:tblCellMar>
-            <w:top w:w="0" w:type="dxa"/>
-            <w:bottom w:w="0" w:type="dxa"/>
-          </w:tblCellMar>
-        </w:tblPrEx>
         <w:trPr>
           <w:cantSplit/>
           <w:tblHeader/>
@@ -11030,12 +10680,6 @@
         </w:tc>
       </w:tr>
       <w:tr>
-        <w:tblPrEx>
-          <w:tblCellMar>
-            <w:top w:w="0" w:type="dxa"/>
-            <w:bottom w:w="0" w:type="dxa"/>
-          </w:tblCellMar>
-        </w:tblPrEx>
         <w:trPr>
           <w:cantSplit/>
         </w:trPr>
@@ -11137,12 +10781,6 @@
         </w:tc>
       </w:tr>
       <w:tr>
-        <w:tblPrEx>
-          <w:tblCellMar>
-            <w:top w:w="0" w:type="dxa"/>
-            <w:bottom w:w="0" w:type="dxa"/>
-          </w:tblCellMar>
-        </w:tblPrEx>
         <w:trPr>
           <w:cantSplit/>
         </w:trPr>
@@ -11244,12 +10882,6 @@
         </w:tc>
       </w:tr>
       <w:tr>
-        <w:tblPrEx>
-          <w:tblCellMar>
-            <w:top w:w="0" w:type="dxa"/>
-            <w:bottom w:w="0" w:type="dxa"/>
-          </w:tblCellMar>
-        </w:tblPrEx>
         <w:trPr>
           <w:cantSplit/>
         </w:trPr>
@@ -11351,12 +10983,6 @@
         </w:tc>
       </w:tr>
       <w:tr>
-        <w:tblPrEx>
-          <w:tblCellMar>
-            <w:top w:w="0" w:type="dxa"/>
-            <w:bottom w:w="0" w:type="dxa"/>
-          </w:tblCellMar>
-        </w:tblPrEx>
         <w:trPr>
           <w:cantSplit/>
         </w:trPr>
@@ -11662,12 +11288,6 @@
         <w:gridCol w:w="2988"/>
       </w:tblGrid>
       <w:tr>
-        <w:tblPrEx>
-          <w:tblCellMar>
-            <w:top w:w="0" w:type="dxa"/>
-            <w:bottom w:w="0" w:type="dxa"/>
-          </w:tblCellMar>
-        </w:tblPrEx>
         <w:trPr>
           <w:cantSplit/>
           <w:tblHeader/>
@@ -11844,12 +11464,6 @@
         </w:tc>
       </w:tr>
       <w:tr>
-        <w:tblPrEx>
-          <w:tblCellMar>
-            <w:top w:w="0" w:type="dxa"/>
-            <w:bottom w:w="0" w:type="dxa"/>
-          </w:tblCellMar>
-        </w:tblPrEx>
         <w:trPr>
           <w:cantSplit/>
         </w:trPr>
@@ -12015,12 +11629,6 @@
         </w:tc>
       </w:tr>
       <w:tr>
-        <w:tblPrEx>
-          <w:tblCellMar>
-            <w:top w:w="0" w:type="dxa"/>
-            <w:bottom w:w="0" w:type="dxa"/>
-          </w:tblCellMar>
-        </w:tblPrEx>
         <w:trPr>
           <w:cantSplit/>
         </w:trPr>
@@ -12186,12 +11794,6 @@
         </w:tc>
       </w:tr>
       <w:tr>
-        <w:tblPrEx>
-          <w:tblCellMar>
-            <w:top w:w="0" w:type="dxa"/>
-            <w:bottom w:w="0" w:type="dxa"/>
-          </w:tblCellMar>
-        </w:tblPrEx>
         <w:trPr>
           <w:cantSplit/>
         </w:trPr>
@@ -12357,12 +11959,6 @@
         </w:tc>
       </w:tr>
       <w:tr>
-        <w:tblPrEx>
-          <w:tblCellMar>
-            <w:top w:w="0" w:type="dxa"/>
-            <w:bottom w:w="0" w:type="dxa"/>
-          </w:tblCellMar>
-        </w:tblPrEx>
         <w:trPr>
           <w:cantSplit/>
         </w:trPr>
@@ -12528,12 +12124,6 @@
         </w:tc>
       </w:tr>
       <w:tr>
-        <w:tblPrEx>
-          <w:tblCellMar>
-            <w:top w:w="0" w:type="dxa"/>
-            <w:bottom w:w="0" w:type="dxa"/>
-          </w:tblCellMar>
-        </w:tblPrEx>
         <w:trPr>
           <w:cantSplit/>
         </w:trPr>
@@ -12699,12 +12289,6 @@
         </w:tc>
       </w:tr>
       <w:tr>
-        <w:tblPrEx>
-          <w:tblCellMar>
-            <w:top w:w="0" w:type="dxa"/>
-            <w:bottom w:w="0" w:type="dxa"/>
-          </w:tblCellMar>
-        </w:tblPrEx>
         <w:trPr>
           <w:cantSplit/>
         </w:trPr>
@@ -12870,12 +12454,6 @@
         </w:tc>
       </w:tr>
       <w:tr>
-        <w:tblPrEx>
-          <w:tblCellMar>
-            <w:top w:w="0" w:type="dxa"/>
-            <w:bottom w:w="0" w:type="dxa"/>
-          </w:tblCellMar>
-        </w:tblPrEx>
         <w:trPr>
           <w:cantSplit/>
         </w:trPr>
@@ -13041,12 +12619,6 @@
         </w:tc>
       </w:tr>
       <w:tr>
-        <w:tblPrEx>
-          <w:tblCellMar>
-            <w:top w:w="0" w:type="dxa"/>
-            <w:bottom w:w="0" w:type="dxa"/>
-          </w:tblCellMar>
-        </w:tblPrEx>
         <w:trPr>
           <w:cantSplit/>
         </w:trPr>
@@ -13487,12 +13059,6 @@
         <w:gridCol w:w="4065"/>
       </w:tblGrid>
       <w:tr>
-        <w:tblPrEx>
-          <w:tblCellMar>
-            <w:top w:w="0" w:type="dxa"/>
-            <w:bottom w:w="0" w:type="dxa"/>
-          </w:tblCellMar>
-        </w:tblPrEx>
         <w:trPr>
           <w:cantSplit/>
           <w:tblHeader/>
@@ -13601,12 +13167,6 @@
         </w:tc>
       </w:tr>
       <w:tr>
-        <w:tblPrEx>
-          <w:tblCellMar>
-            <w:top w:w="0" w:type="dxa"/>
-            <w:bottom w:w="0" w:type="dxa"/>
-          </w:tblCellMar>
-        </w:tblPrEx>
         <w:trPr>
           <w:cantSplit/>
         </w:trPr>
@@ -13708,12 +13268,6 @@
         </w:tc>
       </w:tr>
       <w:tr>
-        <w:tblPrEx>
-          <w:tblCellMar>
-            <w:top w:w="0" w:type="dxa"/>
-            <w:bottom w:w="0" w:type="dxa"/>
-          </w:tblCellMar>
-        </w:tblPrEx>
         <w:trPr>
           <w:cantSplit/>
         </w:trPr>
@@ -13815,12 +13369,6 @@
         </w:tc>
       </w:tr>
       <w:tr>
-        <w:tblPrEx>
-          <w:tblCellMar>
-            <w:top w:w="0" w:type="dxa"/>
-            <w:bottom w:w="0" w:type="dxa"/>
-          </w:tblCellMar>
-        </w:tblPrEx>
         <w:trPr>
           <w:cantSplit/>
         </w:trPr>
@@ -13922,12 +13470,6 @@
         </w:tc>
       </w:tr>
       <w:tr>
-        <w:tblPrEx>
-          <w:tblCellMar>
-            <w:top w:w="0" w:type="dxa"/>
-            <w:bottom w:w="0" w:type="dxa"/>
-          </w:tblCellMar>
-        </w:tblPrEx>
         <w:trPr>
           <w:cantSplit/>
         </w:trPr>
@@ -14029,12 +13571,6 @@
         </w:tc>
       </w:tr>
       <w:tr>
-        <w:tblPrEx>
-          <w:tblCellMar>
-            <w:top w:w="0" w:type="dxa"/>
-            <w:bottom w:w="0" w:type="dxa"/>
-          </w:tblCellMar>
-        </w:tblPrEx>
         <w:trPr>
           <w:cantSplit/>
         </w:trPr>
@@ -14136,12 +13672,6 @@
         </w:tc>
       </w:tr>
       <w:tr>
-        <w:tblPrEx>
-          <w:tblCellMar>
-            <w:top w:w="0" w:type="dxa"/>
-            <w:bottom w:w="0" w:type="dxa"/>
-          </w:tblCellMar>
-        </w:tblPrEx>
         <w:trPr>
           <w:cantSplit/>
         </w:trPr>
@@ -14243,12 +13773,6 @@
         </w:tc>
       </w:tr>
       <w:tr>
-        <w:tblPrEx>
-          <w:tblCellMar>
-            <w:top w:w="0" w:type="dxa"/>
-            <w:bottom w:w="0" w:type="dxa"/>
-          </w:tblCellMar>
-        </w:tblPrEx>
         <w:trPr>
           <w:cantSplit/>
         </w:trPr>
@@ -14350,12 +13874,6 @@
         </w:tc>
       </w:tr>
       <w:tr>
-        <w:tblPrEx>
-          <w:tblCellMar>
-            <w:top w:w="0" w:type="dxa"/>
-            <w:bottom w:w="0" w:type="dxa"/>
-          </w:tblCellMar>
-        </w:tblPrEx>
         <w:trPr>
           <w:cantSplit/>
         </w:trPr>
@@ -14457,12 +13975,6 @@
         </w:tc>
       </w:tr>
       <w:tr>
-        <w:tblPrEx>
-          <w:tblCellMar>
-            <w:top w:w="0" w:type="dxa"/>
-            <w:bottom w:w="0" w:type="dxa"/>
-          </w:tblCellMar>
-        </w:tblPrEx>
         <w:trPr>
           <w:cantSplit/>
         </w:trPr>
@@ -14638,12 +14150,6 @@
         <w:gridCol w:w="6855"/>
       </w:tblGrid>
       <w:tr>
-        <w:tblPrEx>
-          <w:tblCellMar>
-            <w:top w:w="0" w:type="dxa"/>
-            <w:bottom w:w="0" w:type="dxa"/>
-          </w:tblCellMar>
-        </w:tblPrEx>
         <w:trPr>
           <w:cantSplit/>
           <w:tblHeader/>
@@ -14718,12 +14224,6 @@
         </w:tc>
       </w:tr>
       <w:tr>
-        <w:tblPrEx>
-          <w:tblCellMar>
-            <w:top w:w="0" w:type="dxa"/>
-            <w:bottom w:w="0" w:type="dxa"/>
-          </w:tblCellMar>
-        </w:tblPrEx>
         <w:trPr>
           <w:cantSplit/>
         </w:trPr>
@@ -14793,12 +14293,6 @@
         </w:tc>
       </w:tr>
       <w:tr>
-        <w:tblPrEx>
-          <w:tblCellMar>
-            <w:top w:w="0" w:type="dxa"/>
-            <w:bottom w:w="0" w:type="dxa"/>
-          </w:tblCellMar>
-        </w:tblPrEx>
         <w:trPr>
           <w:cantSplit/>
         </w:trPr>
@@ -14868,12 +14362,6 @@
         </w:tc>
       </w:tr>
       <w:tr>
-        <w:tblPrEx>
-          <w:tblCellMar>
-            <w:top w:w="0" w:type="dxa"/>
-            <w:bottom w:w="0" w:type="dxa"/>
-          </w:tblCellMar>
-        </w:tblPrEx>
         <w:trPr>
           <w:cantSplit/>
         </w:trPr>
@@ -14943,12 +14431,6 @@
         </w:tc>
       </w:tr>
       <w:tr>
-        <w:tblPrEx>
-          <w:tblCellMar>
-            <w:top w:w="0" w:type="dxa"/>
-            <w:bottom w:w="0" w:type="dxa"/>
-          </w:tblCellMar>
-        </w:tblPrEx>
         <w:trPr>
           <w:cantSplit/>
         </w:trPr>
@@ -15280,12 +14762,6 @@
         <w:gridCol w:w="5449"/>
       </w:tblGrid>
       <w:tr>
-        <w:tblPrEx>
-          <w:tblCellMar>
-            <w:top w:w="0" w:type="dxa"/>
-            <w:bottom w:w="0" w:type="dxa"/>
-          </w:tblCellMar>
-        </w:tblPrEx>
         <w:trPr>
           <w:cantSplit/>
           <w:tblHeader/>
@@ -15394,12 +14870,6 @@
         </w:tc>
       </w:tr>
       <w:tr>
-        <w:tblPrEx>
-          <w:tblCellMar>
-            <w:top w:w="0" w:type="dxa"/>
-            <w:bottom w:w="0" w:type="dxa"/>
-          </w:tblCellMar>
-        </w:tblPrEx>
         <w:trPr>
           <w:cantSplit/>
         </w:trPr>
@@ -15501,12 +14971,6 @@
         </w:tc>
       </w:tr>
       <w:tr>
-        <w:tblPrEx>
-          <w:tblCellMar>
-            <w:top w:w="0" w:type="dxa"/>
-            <w:bottom w:w="0" w:type="dxa"/>
-          </w:tblCellMar>
-        </w:tblPrEx>
         <w:trPr>
           <w:cantSplit/>
         </w:trPr>
@@ -15608,12 +15072,6 @@
         </w:tc>
       </w:tr>
       <w:tr>
-        <w:tblPrEx>
-          <w:tblCellMar>
-            <w:top w:w="0" w:type="dxa"/>
-            <w:bottom w:w="0" w:type="dxa"/>
-          </w:tblCellMar>
-        </w:tblPrEx>
         <w:trPr>
           <w:cantSplit/>
         </w:trPr>
@@ -15715,12 +15173,6 @@
         </w:tc>
       </w:tr>
       <w:tr>
-        <w:tblPrEx>
-          <w:tblCellMar>
-            <w:top w:w="0" w:type="dxa"/>
-            <w:bottom w:w="0" w:type="dxa"/>
-          </w:tblCellMar>
-        </w:tblPrEx>
         <w:trPr>
           <w:cantSplit/>
         </w:trPr>
@@ -15822,12 +15274,6 @@
         </w:tc>
       </w:tr>
       <w:tr>
-        <w:tblPrEx>
-          <w:tblCellMar>
-            <w:top w:w="0" w:type="dxa"/>
-            <w:bottom w:w="0" w:type="dxa"/>
-          </w:tblCellMar>
-        </w:tblPrEx>
         <w:trPr>
           <w:cantSplit/>
         </w:trPr>
@@ -15987,12 +15433,6 @@
         <w:gridCol w:w="5273"/>
       </w:tblGrid>
       <w:tr>
-        <w:tblPrEx>
-          <w:tblCellMar>
-            <w:top w:w="0" w:type="dxa"/>
-            <w:bottom w:w="0" w:type="dxa"/>
-          </w:tblCellMar>
-        </w:tblPrEx>
         <w:trPr>
           <w:cantSplit/>
           <w:tblHeader/>
@@ -16067,12 +15507,6 @@
         </w:tc>
       </w:tr>
       <w:tr>
-        <w:tblPrEx>
-          <w:tblCellMar>
-            <w:top w:w="0" w:type="dxa"/>
-            <w:bottom w:w="0" w:type="dxa"/>
-          </w:tblCellMar>
-        </w:tblPrEx>
         <w:trPr>
           <w:cantSplit/>
         </w:trPr>
@@ -16142,12 +15576,6 @@
         </w:tc>
       </w:tr>
       <w:tr>
-        <w:tblPrEx>
-          <w:tblCellMar>
-            <w:top w:w="0" w:type="dxa"/>
-            <w:bottom w:w="0" w:type="dxa"/>
-          </w:tblCellMar>
-        </w:tblPrEx>
         <w:trPr>
           <w:cantSplit/>
         </w:trPr>
@@ -16217,12 +15645,6 @@
         </w:tc>
       </w:tr>
       <w:tr>
-        <w:tblPrEx>
-          <w:tblCellMar>
-            <w:top w:w="0" w:type="dxa"/>
-            <w:bottom w:w="0" w:type="dxa"/>
-          </w:tblCellMar>
-        </w:tblPrEx>
         <w:trPr>
           <w:cantSplit/>
         </w:trPr>
@@ -16292,12 +15714,6 @@
         </w:tc>
       </w:tr>
       <w:tr>
-        <w:tblPrEx>
-          <w:tblCellMar>
-            <w:top w:w="0" w:type="dxa"/>
-            <w:bottom w:w="0" w:type="dxa"/>
-          </w:tblCellMar>
-        </w:tblPrEx>
         <w:trPr>
           <w:cantSplit/>
         </w:trPr>
@@ -16367,12 +15783,6 @@
         </w:tc>
       </w:tr>
       <w:tr>
-        <w:tblPrEx>
-          <w:tblCellMar>
-            <w:top w:w="0" w:type="dxa"/>
-            <w:bottom w:w="0" w:type="dxa"/>
-          </w:tblCellMar>
-        </w:tblPrEx>
         <w:trPr>
           <w:cantSplit/>
         </w:trPr>
@@ -16442,12 +15852,6 @@
         </w:tc>
       </w:tr>
       <w:tr>
-        <w:tblPrEx>
-          <w:tblCellMar>
-            <w:top w:w="0" w:type="dxa"/>
-            <w:bottom w:w="0" w:type="dxa"/>
-          </w:tblCellMar>
-        </w:tblPrEx>
         <w:trPr>
           <w:cantSplit/>
         </w:trPr>
@@ -16517,12 +15921,6 @@
         </w:tc>
       </w:tr>
       <w:tr>
-        <w:tblPrEx>
-          <w:tblCellMar>
-            <w:top w:w="0" w:type="dxa"/>
-            <w:bottom w:w="0" w:type="dxa"/>
-          </w:tblCellMar>
-        </w:tblPrEx>
         <w:trPr>
           <w:cantSplit/>
         </w:trPr>
@@ -16592,12 +15990,6 @@
         </w:tc>
       </w:tr>
       <w:tr>
-        <w:tblPrEx>
-          <w:tblCellMar>
-            <w:top w:w="0" w:type="dxa"/>
-            <w:bottom w:w="0" w:type="dxa"/>
-          </w:tblCellMar>
-        </w:tblPrEx>
         <w:trPr>
           <w:cantSplit/>
         </w:trPr>
@@ -16994,12 +16386,6 @@
         <w:gridCol w:w="5639"/>
       </w:tblGrid>
       <w:tr>
-        <w:tblPrEx>
-          <w:tblCellMar>
-            <w:top w:w="0" w:type="dxa"/>
-            <w:bottom w:w="0" w:type="dxa"/>
-          </w:tblCellMar>
-        </w:tblPrEx>
         <w:trPr>
           <w:cantSplit/>
           <w:tblHeader/>
@@ -17075,12 +16461,6 @@
         </w:tc>
       </w:tr>
       <w:tr>
-        <w:tblPrEx>
-          <w:tblCellMar>
-            <w:top w:w="0" w:type="dxa"/>
-            <w:bottom w:w="0" w:type="dxa"/>
-          </w:tblCellMar>
-        </w:tblPrEx>
         <w:trPr>
           <w:cantSplit/>
         </w:trPr>
@@ -17151,12 +16531,6 @@
         </w:tc>
       </w:tr>
       <w:tr>
-        <w:tblPrEx>
-          <w:tblCellMar>
-            <w:top w:w="0" w:type="dxa"/>
-            <w:bottom w:w="0" w:type="dxa"/>
-          </w:tblCellMar>
-        </w:tblPrEx>
         <w:trPr>
           <w:cantSplit/>
         </w:trPr>
@@ -17227,12 +16601,6 @@
         </w:tc>
       </w:tr>
       <w:tr>
-        <w:tblPrEx>
-          <w:tblCellMar>
-            <w:top w:w="0" w:type="dxa"/>
-            <w:bottom w:w="0" w:type="dxa"/>
-          </w:tblCellMar>
-        </w:tblPrEx>
         <w:trPr>
           <w:cantSplit/>
         </w:trPr>
@@ -17303,12 +16671,6 @@
         </w:tc>
       </w:tr>
       <w:tr>
-        <w:tblPrEx>
-          <w:tblCellMar>
-            <w:top w:w="0" w:type="dxa"/>
-            <w:bottom w:w="0" w:type="dxa"/>
-          </w:tblCellMar>
-        </w:tblPrEx>
         <w:trPr>
           <w:cantSplit/>
         </w:trPr>
@@ -17379,12 +16741,6 @@
         </w:tc>
       </w:tr>
       <w:tr>
-        <w:tblPrEx>
-          <w:tblCellMar>
-            <w:top w:w="0" w:type="dxa"/>
-            <w:bottom w:w="0" w:type="dxa"/>
-          </w:tblCellMar>
-        </w:tblPrEx>
         <w:trPr>
           <w:cantSplit/>
         </w:trPr>
@@ -17455,12 +16811,6 @@
         </w:tc>
       </w:tr>
       <w:tr>
-        <w:tblPrEx>
-          <w:tblCellMar>
-            <w:top w:w="0" w:type="dxa"/>
-            <w:bottom w:w="0" w:type="dxa"/>
-          </w:tblCellMar>
-        </w:tblPrEx>
         <w:trPr>
           <w:cantSplit/>
         </w:trPr>
@@ -17531,12 +16881,6 @@
         </w:tc>
       </w:tr>
       <w:tr>
-        <w:tblPrEx>
-          <w:tblCellMar>
-            <w:top w:w="0" w:type="dxa"/>
-            <w:bottom w:w="0" w:type="dxa"/>
-          </w:tblCellMar>
-        </w:tblPrEx>
         <w:trPr>
           <w:cantSplit/>
         </w:trPr>
@@ -17608,12 +16952,6 @@
         </w:tc>
       </w:tr>
       <w:tr>
-        <w:tblPrEx>
-          <w:tblCellMar>
-            <w:top w:w="0" w:type="dxa"/>
-            <w:bottom w:w="0" w:type="dxa"/>
-          </w:tblCellMar>
-        </w:tblPrEx>
         <w:trPr>
           <w:cantSplit/>
         </w:trPr>
@@ -17684,12 +17022,6 @@
         </w:tc>
       </w:tr>
       <w:tr>
-        <w:tblPrEx>
-          <w:tblCellMar>
-            <w:top w:w="0" w:type="dxa"/>
-            <w:bottom w:w="0" w:type="dxa"/>
-          </w:tblCellMar>
-        </w:tblPrEx>
         <w:trPr>
           <w:cantSplit/>
         </w:trPr>
@@ -17760,12 +17092,6 @@
         </w:tc>
       </w:tr>
       <w:tr>
-        <w:tblPrEx>
-          <w:tblCellMar>
-            <w:top w:w="0" w:type="dxa"/>
-            <w:bottom w:w="0" w:type="dxa"/>
-          </w:tblCellMar>
-        </w:tblPrEx>
         <w:trPr>
           <w:cantSplit/>
         </w:trPr>
@@ -17836,12 +17162,6 @@
         </w:tc>
       </w:tr>
       <w:tr>
-        <w:tblPrEx>
-          <w:tblCellMar>
-            <w:top w:w="0" w:type="dxa"/>
-            <w:bottom w:w="0" w:type="dxa"/>
-          </w:tblCellMar>
-        </w:tblPrEx>
         <w:trPr>
           <w:cantSplit/>
         </w:trPr>
@@ -17912,12 +17232,6 @@
         </w:tc>
       </w:tr>
       <w:tr>
-        <w:tblPrEx>
-          <w:tblCellMar>
-            <w:top w:w="0" w:type="dxa"/>
-            <w:bottom w:w="0" w:type="dxa"/>
-          </w:tblCellMar>
-        </w:tblPrEx>
         <w:trPr>
           <w:cantSplit/>
         </w:trPr>
@@ -18522,12 +17836,6 @@
         <w:gridCol w:w="1582"/>
       </w:tblGrid>
       <w:tr>
-        <w:tblPrEx>
-          <w:tblCellMar>
-            <w:top w:w="0" w:type="dxa"/>
-            <w:bottom w:w="0" w:type="dxa"/>
-          </w:tblCellMar>
-        </w:tblPrEx>
         <w:trPr>
           <w:cantSplit/>
           <w:tblHeader/>
@@ -18670,12 +17978,6 @@
         </w:tc>
       </w:tr>
       <w:tr>
-        <w:tblPrEx>
-          <w:tblCellMar>
-            <w:top w:w="0" w:type="dxa"/>
-            <w:bottom w:w="0" w:type="dxa"/>
-          </w:tblCellMar>
-        </w:tblPrEx>
         <w:trPr>
           <w:cantSplit/>
         </w:trPr>
@@ -18809,12 +18111,6 @@
         </w:tc>
       </w:tr>
       <w:tr>
-        <w:tblPrEx>
-          <w:tblCellMar>
-            <w:top w:w="0" w:type="dxa"/>
-            <w:bottom w:w="0" w:type="dxa"/>
-          </w:tblCellMar>
-        </w:tblPrEx>
         <w:trPr>
           <w:cantSplit/>
         </w:trPr>
@@ -18948,12 +18244,6 @@
         </w:tc>
       </w:tr>
       <w:tr>
-        <w:tblPrEx>
-          <w:tblCellMar>
-            <w:top w:w="0" w:type="dxa"/>
-            <w:bottom w:w="0" w:type="dxa"/>
-          </w:tblCellMar>
-        </w:tblPrEx>
         <w:trPr>
           <w:cantSplit/>
         </w:trPr>
@@ -19087,12 +18377,6 @@
         </w:tc>
       </w:tr>
       <w:tr>
-        <w:tblPrEx>
-          <w:tblCellMar>
-            <w:top w:w="0" w:type="dxa"/>
-            <w:bottom w:w="0" w:type="dxa"/>
-          </w:tblCellMar>
-        </w:tblPrEx>
         <w:trPr>
           <w:cantSplit/>
         </w:trPr>
@@ -19226,12 +18510,6 @@
         </w:tc>
       </w:tr>
       <w:tr>
-        <w:tblPrEx>
-          <w:tblCellMar>
-            <w:top w:w="0" w:type="dxa"/>
-            <w:bottom w:w="0" w:type="dxa"/>
-          </w:tblCellMar>
-        </w:tblPrEx>
         <w:trPr>
           <w:cantSplit/>
         </w:trPr>
@@ -19365,12 +18643,6 @@
         </w:tc>
       </w:tr>
       <w:tr>
-        <w:tblPrEx>
-          <w:tblCellMar>
-            <w:top w:w="0" w:type="dxa"/>
-            <w:bottom w:w="0" w:type="dxa"/>
-          </w:tblCellMar>
-        </w:tblPrEx>
         <w:trPr>
           <w:cantSplit/>
         </w:trPr>
@@ -19504,12 +18776,6 @@
         </w:tc>
       </w:tr>
       <w:tr>
-        <w:tblPrEx>
-          <w:tblCellMar>
-            <w:top w:w="0" w:type="dxa"/>
-            <w:bottom w:w="0" w:type="dxa"/>
-          </w:tblCellMar>
-        </w:tblPrEx>
         <w:trPr>
           <w:cantSplit/>
         </w:trPr>
@@ -19643,12 +18909,6 @@
         </w:tc>
       </w:tr>
       <w:tr>
-        <w:tblPrEx>
-          <w:tblCellMar>
-            <w:top w:w="0" w:type="dxa"/>
-            <w:bottom w:w="0" w:type="dxa"/>
-          </w:tblCellMar>
-        </w:tblPrEx>
         <w:trPr>
           <w:cantSplit/>
         </w:trPr>
@@ -19782,12 +19042,6 @@
         </w:tc>
       </w:tr>
       <w:tr>
-        <w:tblPrEx>
-          <w:tblCellMar>
-            <w:top w:w="0" w:type="dxa"/>
-            <w:bottom w:w="0" w:type="dxa"/>
-          </w:tblCellMar>
-        </w:tblPrEx>
         <w:trPr>
           <w:cantSplit/>
         </w:trPr>
@@ -19921,12 +19175,6 @@
         </w:tc>
       </w:tr>
       <w:tr>
-        <w:tblPrEx>
-          <w:tblCellMar>
-            <w:top w:w="0" w:type="dxa"/>
-            <w:bottom w:w="0" w:type="dxa"/>
-          </w:tblCellMar>
-        </w:tblPrEx>
         <w:trPr>
           <w:cantSplit/>
         </w:trPr>
@@ -20060,12 +19308,6 @@
         </w:tc>
       </w:tr>
       <w:tr>
-        <w:tblPrEx>
-          <w:tblCellMar>
-            <w:top w:w="0" w:type="dxa"/>
-            <w:bottom w:w="0" w:type="dxa"/>
-          </w:tblCellMar>
-        </w:tblPrEx>
         <w:trPr>
           <w:cantSplit/>
         </w:trPr>
@@ -20199,12 +19441,6 @@
         </w:tc>
       </w:tr>
       <w:tr>
-        <w:tblPrEx>
-          <w:tblCellMar>
-            <w:top w:w="0" w:type="dxa"/>
-            <w:bottom w:w="0" w:type="dxa"/>
-          </w:tblCellMar>
-        </w:tblPrEx>
         <w:trPr>
           <w:cantSplit/>
         </w:trPr>
@@ -20338,12 +19574,6 @@
         </w:tc>
       </w:tr>
       <w:tr>
-        <w:tblPrEx>
-          <w:tblCellMar>
-            <w:top w:w="0" w:type="dxa"/>
-            <w:bottom w:w="0" w:type="dxa"/>
-          </w:tblCellMar>
-        </w:tblPrEx>
         <w:trPr>
           <w:cantSplit/>
         </w:trPr>
@@ -20478,12 +19708,6 @@
         </w:tc>
       </w:tr>
       <w:tr>
-        <w:tblPrEx>
-          <w:tblCellMar>
-            <w:top w:w="0" w:type="dxa"/>
-            <w:bottom w:w="0" w:type="dxa"/>
-          </w:tblCellMar>
-        </w:tblPrEx>
         <w:trPr>
           <w:cantSplit/>
         </w:trPr>
@@ -22101,7 +21325,17 @@
         <w:szCs w:val="21"/>
         <w:rtl/>
       </w:rPr>
-      <w:t>39</w:t>
+      <w:t>3</w:t>
+    </w:r>
+    <w:r>
+      <w:rPr>
+        <w:rFonts w:cs="Times New Roman"/>
+        <w:noProof/>
+        <w:sz w:val="21"/>
+        <w:szCs w:val="21"/>
+        <w:rtl/>
+      </w:rPr>
+      <w:t>9</w:t>
     </w:r>
     <w:r>
       <w:rPr>
@@ -22153,7 +21387,17 @@
         <w:szCs w:val="21"/>
         <w:rtl/>
       </w:rPr>
-      <w:t>40</w:t>
+      <w:t>4</w:t>
+    </w:r>
+    <w:r>
+      <w:rPr>
+        <w:rFonts w:cs="Times New Roman"/>
+        <w:noProof/>
+        <w:sz w:val="21"/>
+        <w:szCs w:val="21"/>
+        <w:rtl/>
+      </w:rPr>
+      <w:t>0</w:t>
     </w:r>
     <w:r>
       <w:rPr>

</xml_diff>

<commit_message>
chore(report,demo): updated report docx + ML animation keyframes
- report docx refresh + render/gifframes keyframes used by the ML GIF
- demo README: markdown table reformat only
</commit_message>
<xml_diff>
--- a/report/SmartHome-Project-Report.docx
+++ b/report/SmartHome-Project-Report.docx
@@ -34,6 +34,9 @@
         <w:jc w:val="center"/>
       </w:pPr>
       <w:r>
+        <w:rPr>
+          <w:noProof/>
+        </w:rPr>
         <w:lastRenderedPageBreak/>
         <w:drawing>
           <wp:inline distT="0" distB="0" distL="0" distR="0" wp14:anchorId="33C1B581" wp14:editId="295CDB53">
@@ -1057,7 +1060,6 @@
         <w:spacing w:before="200"/>
         <w:jc w:val="highKashida"/>
         <w:rPr>
-          <w:rFonts w:hint="cs"/>
           <w:rtl/>
         </w:rPr>
       </w:pPr>
@@ -6728,7 +6730,6 @@
         <w:ind w:firstLine="480"/>
         <w:jc w:val="both"/>
         <w:rPr>
-          <w:rFonts w:hint="cs"/>
           <w:rtl/>
         </w:rPr>
       </w:pPr>
@@ -6739,6 +6740,9 @@
         <w:jc w:val="center"/>
       </w:pPr>
       <w:r>
+        <w:rPr>
+          <w:noProof/>
+        </w:rPr>
         <w:drawing>
           <wp:inline distT="0" distB="0" distL="0" distR="0" wp14:anchorId="0D576E9D" wp14:editId="6E3B3EAB">
             <wp:extent cx="5429250" cy="3790950"/>
@@ -6786,17 +6790,7 @@
           <w:szCs w:val="24"/>
           <w:rtl/>
         </w:rPr>
-        <w:t xml:space="preserve"> </w:t>
-      </w:r>
-      <w:r>
-        <w:rPr>
-          <w:b/>
-          <w:bCs/>
-          <w:sz w:val="24"/>
-          <w:szCs w:val="24"/>
-          <w:rtl/>
-        </w:rPr>
-        <w:t>شکل ۱-۱: بلوک دیاگرام کلی سامانه خانه هوشمند مبتنی بر پردازش روی لبه</w:t>
+        <w:t xml:space="preserve"> شکل ۱-۱: بلوک دیاگرام کلی سامانه خانه هوشمند مبتنی بر پردازش روی لبه</w:t>
       </w:r>
     </w:p>
     <w:p>
@@ -8677,6 +8671,9 @@
       </w:pPr>
       <w:bookmarkStart w:id="8" w:name="_Toc240962701"/>
       <w:r>
+        <w:rPr>
+          <w:noProof/>
+        </w:rPr>
         <w:drawing>
           <wp:anchor distT="0" distB="0" distL="114300" distR="114300" simplePos="0" relativeHeight="251658240" behindDoc="1" locked="0" layoutInCell="1" allowOverlap="1" wp14:anchorId="382942B6" wp14:editId="16A09DB8">
             <wp:simplePos x="0" y="0"/>
@@ -11270,7 +11267,6 @@
       <w:pPr>
         <w:spacing w:line="300" w:lineRule="auto"/>
         <w:jc w:val="center"/>
-        <w:cnfStyle w:val="101000000000" w:firstRow="1" w:lastRow="0" w:firstColumn="1" w:lastColumn="0" w:oddVBand="0" w:evenVBand="0" w:oddHBand="0" w:evenHBand="0" w:firstRowFirstColumn="0" w:firstRowLastColumn="0" w:lastRowFirstColumn="0" w:lastRowLastColumn="0"/>
         <w:rPr>
           <w:b/>
           <w:bCs/>
@@ -12424,7 +12420,6 @@
         <w:bidi/>
         <w:spacing w:line="414" w:lineRule="atLeast"/>
         <w:rPr>
-          <w:rFonts w:hint="cs"/>
           <w:rtl/>
         </w:rPr>
       </w:pPr>
@@ -15618,6 +15613,9 @@
         <w:jc w:val="center"/>
       </w:pPr>
       <w:r>
+        <w:rPr>
+          <w:noProof/>
+        </w:rPr>
         <w:drawing>
           <wp:inline distT="0" distB="0" distL="0" distR="0" wp14:anchorId="6A56C13D" wp14:editId="7F557857">
             <wp:extent cx="4875866" cy="3476625"/>
@@ -17760,6 +17758,9 @@
         <w:jc w:val="center"/>
       </w:pPr>
       <w:r>
+        <w:rPr>
+          <w:noProof/>
+        </w:rPr>
         <w:drawing>
           <wp:inline distT="0" distB="0" distL="0" distR="0" wp14:anchorId="408952F7" wp14:editId="2AFE782F">
             <wp:extent cx="5429250" cy="3513219"/>
@@ -20300,6 +20301,9 @@
         <w:jc w:val="center"/>
       </w:pPr>
       <w:r>
+        <w:rPr>
+          <w:noProof/>
+        </w:rPr>
         <w:drawing>
           <wp:inline distT="0" distB="0" distL="0" distR="0" wp14:anchorId="1C1EF819" wp14:editId="2323AF08">
             <wp:extent cx="4854803" cy="2276475"/>
@@ -21700,13 +21704,7 @@
         <w:rPr>
           <w:rtl/>
         </w:rPr>
-        <w:t xml:space="preserve"> </w:t>
-      </w:r>
-      <w:r>
-        <w:rPr>
-          <w:rtl/>
-        </w:rPr>
-        <w:t xml:space="preserve">جدول ۶-۱ ساختار کامل بردار </w:t>
+        <w:t xml:space="preserve"> جدول ۶-۱ ساختار کامل بردار </w:t>
       </w:r>
       <w:r>
         <w:rPr>
@@ -23496,6 +23494,9 @@
         <w:jc w:val="center"/>
       </w:pPr>
       <w:r>
+        <w:rPr>
+          <w:noProof/>
+        </w:rPr>
         <w:drawing>
           <wp:inline distT="0" distB="0" distL="0" distR="0" wp14:anchorId="59E667D4" wp14:editId="2950FDC1">
             <wp:extent cx="5071757" cy="2714625"/>
@@ -24369,6 +24370,9 @@
         <w:jc w:val="center"/>
       </w:pPr>
       <w:r>
+        <w:rPr>
+          <w:noProof/>
+        </w:rPr>
         <w:drawing>
           <wp:inline distT="0" distB="0" distL="0" distR="0" wp14:anchorId="23A35E67" wp14:editId="04E6E7A3">
             <wp:extent cx="5267258" cy="3000375"/>
@@ -24472,7 +24476,20 @@
         <w:rPr>
           <w:rtl/>
         </w:rPr>
-        <w:t>برد با LVGL 9.5 شامل شش صفحه است:</w:t>
+        <w:t xml:space="preserve">برد با LVGL 9.5 شامل </w:t>
+      </w:r>
+      <w:r>
+        <w:rPr>
+          <w:rFonts w:hint="cs"/>
+          <w:rtl/>
+        </w:rPr>
+        <w:t>چند</w:t>
+      </w:r>
+      <w:r>
+        <w:rPr>
+          <w:rtl/>
+        </w:rPr>
+        <w:t xml:space="preserve"> صفحه است:</w:t>
       </w:r>
     </w:p>
     <w:p>
@@ -24493,7 +24510,33 @@
         <w:rPr>
           <w:rtl/>
         </w:rPr>
-        <w:t>داشبورد اصلی (وضعیت وای‌فای و آدرس IP با QR، وضعیت MQTT با کلید واقعی، دکمه حضور و غیاب، کنترل چراغ و فن، دکمه بازکردن قفل، دکمه حالت مدل که با ضربه کوتاه بین خودکار/سایه جابه‌جا و با نگه‌داشتن جزئیات را نشان می‌دهد، و سه کارت سنسوری ۹۶×۹۶ دما/رطوبت/فشار)</w:t>
+        <w:t>داشبورد اصلی (وضعیت وای‌فا</w:t>
+      </w:r>
+      <w:r>
+        <w:rPr>
+          <w:rFonts w:hint="cs"/>
+          <w:rtl/>
+        </w:rPr>
+        <w:t xml:space="preserve">ی </w:t>
+      </w:r>
+      <w:r>
+        <w:rPr>
+          <w:rtl/>
+        </w:rPr>
+        <w:t>، وضعیت MQTT ،</w:t>
+      </w:r>
+      <w:r>
+        <w:rPr>
+          <w:rFonts w:hint="cs"/>
+          <w:rtl/>
+        </w:rPr>
+        <w:t xml:space="preserve"> دکمه داشبورد وب ،</w:t>
+      </w:r>
+      <w:r>
+        <w:rPr>
+          <w:rtl/>
+        </w:rPr>
+        <w:t xml:space="preserve"> دکمه حضور و غیاب، کنترل چراغ و فن، دکمه بازکردن قفل، دکمه حالت مدل که با ضربه کوتاه بین خودکار/سایه جابه‌جا و با نگه‌داشتن جزئیات را نشان می‌دهد، و سه کارت سنسوری ۹۶×۹۶ دما/رطوبت/فشار)</w:t>
       </w:r>
     </w:p>
     <w:p>
@@ -24938,6 +24981,7 @@
               </w:rPr>
               <w:t>/</w:t>
             </w:r>
+            <w:proofErr w:type="gramStart"/>
             <w:r>
               <w:rPr>
                 <w:sz w:val="22"/>
@@ -24946,6 +24990,7 @@
               </w:rPr>
               <w:t>recognize</w:t>
             </w:r>
+            <w:proofErr w:type="gramEnd"/>
           </w:p>
         </w:tc>
         <w:tc>
@@ -24999,6 +25044,7 @@
               </w:rPr>
               <w:t>/</w:t>
             </w:r>
+            <w:proofErr w:type="gramStart"/>
             <w:r>
               <w:rPr>
                 <w:sz w:val="22"/>
@@ -25007,6 +25053,7 @@
               </w:rPr>
               <w:t>enroll?token</w:t>
             </w:r>
+            <w:proofErr w:type="gramEnd"/>
           </w:p>
         </w:tc>
         <w:tc>
@@ -25057,6 +25104,7 @@
               </w:rPr>
               <w:t>/</w:t>
             </w:r>
+            <w:proofErr w:type="gramStart"/>
             <w:r>
               <w:rPr>
                 <w:sz w:val="22"/>
@@ -25065,6 +25113,7 @@
               </w:rPr>
               <w:t>attendance?token</w:t>
             </w:r>
+            <w:proofErr w:type="gramEnd"/>
           </w:p>
         </w:tc>
         <w:tc>
@@ -25118,6 +25167,7 @@
               </w:rPr>
               <w:t>/</w:t>
             </w:r>
+            <w:proofErr w:type="gramStart"/>
             <w:r>
               <w:rPr>
                 <w:sz w:val="22"/>
@@ -25126,6 +25176,7 @@
               </w:rPr>
               <w:t>password</w:t>
             </w:r>
+            <w:proofErr w:type="gramEnd"/>
           </w:p>
         </w:tc>
         <w:tc>
@@ -25226,7 +25277,6 @@
               <w:spacing w:line="300" w:lineRule="auto"/>
               <w:jc w:val="center"/>
               <w:rPr>
-                <w:rFonts w:hint="cs"/>
                 <w:sz w:val="22"/>
                 <w:szCs w:val="22"/>
               </w:rPr>
@@ -26181,6 +26231,9 @@
         <w:jc w:val="center"/>
       </w:pPr>
       <w:r>
+        <w:rPr>
+          <w:noProof/>
+        </w:rPr>
         <w:drawing>
           <wp:inline distT="0" distB="0" distL="0" distR="0" wp14:anchorId="5FE11407" wp14:editId="6864FA65">
             <wp:extent cx="5275388" cy="3057525"/>
@@ -27878,7 +27931,6 @@
         <w:ind w:firstLine="480"/>
         <w:jc w:val="both"/>
         <w:rPr>
-          <w:rFonts w:hint="cs"/>
           <w:rtl/>
         </w:rPr>
       </w:pPr>
@@ -28764,8 +28816,13 @@
         <w:t xml:space="preserve">در نسخه فعلی، کارگزار </w:t>
       </w:r>
       <w:r>
-        <w:t>MQTT/Mosquitto</w:t>
-      </w:r>
+        <w:t>MQTT/</w:t>
+      </w:r>
+      <w:proofErr w:type="spellStart"/>
+      <w:r>
+        <w:t>Mosquitto</w:t>
+      </w:r>
+      <w:proofErr w:type="spellEnd"/>
       <w:r>
         <w:rPr>
           <w:rFonts w:hint="cs"/>
@@ -31548,13 +31605,7 @@
         <w:rPr>
           <w:rtl/>
         </w:rPr>
-        <w:t>لختی‌وار</w:t>
-      </w:r>
-      <w:r>
-        <w:rPr>
-          <w:rtl/>
-        </w:rPr>
-        <w:t xml:space="preserve"> </w:t>
+        <w:t xml:space="preserve">لختی‌وار </w:t>
       </w:r>
       <w:r>
         <w:rPr>
@@ -32639,7 +32690,6 @@
         <w:bidi/>
         <w:spacing w:line="414" w:lineRule="atLeast"/>
         <w:rPr>
-          <w:rFonts w:hint="cs"/>
           <w:rtl/>
         </w:rPr>
       </w:pPr>
@@ -32667,7 +32717,23 @@
           <w:sz w:val="21"/>
           <w:szCs w:val="21"/>
         </w:rPr>
-        <w:t>[1] Espressif Systems, “ESP-IDF Programming Guide (v6.x).” [Online]. Available: https://docs.espressif.com/projects/esp-idf/</w:t>
+        <w:t xml:space="preserve">[1] </w:t>
+      </w:r>
+      <w:proofErr w:type="spellStart"/>
+      <w:r>
+        <w:rPr>
+          <w:sz w:val="21"/>
+          <w:szCs w:val="21"/>
+        </w:rPr>
+        <w:t>Espressif</w:t>
+      </w:r>
+      <w:proofErr w:type="spellEnd"/>
+      <w:r>
+        <w:rPr>
+          <w:sz w:val="21"/>
+          <w:szCs w:val="21"/>
+        </w:rPr>
+        <w:t xml:space="preserve"> Systems, “ESP-IDF Programming Guide (v6.x).” [Online]. Available: https://docs.espressif.com/projects/esp-idf/</w:t>
       </w:r>
     </w:p>
     <w:p>
@@ -32681,7 +32747,23 @@
           <w:sz w:val="21"/>
           <w:szCs w:val="21"/>
         </w:rPr>
-        <w:t>[2] Espressif Systems, “ESP-DL: Deep Learning Library for ESP Series.” [Online]. Available: https://github.com/espressif/esp-dl</w:t>
+        <w:t xml:space="preserve">[2] </w:t>
+      </w:r>
+      <w:proofErr w:type="spellStart"/>
+      <w:r>
+        <w:rPr>
+          <w:sz w:val="21"/>
+          <w:szCs w:val="21"/>
+        </w:rPr>
+        <w:t>Espressif</w:t>
+      </w:r>
+      <w:proofErr w:type="spellEnd"/>
+      <w:r>
+        <w:rPr>
+          <w:sz w:val="21"/>
+          <w:szCs w:val="21"/>
+        </w:rPr>
+        <w:t xml:space="preserve"> Systems, “ESP-DL: Deep Learning Library for ESP Series.” [Online]. Available: https://github.com/espressif/esp-dl</w:t>
       </w:r>
     </w:p>
     <w:p>
@@ -32695,7 +32777,55 @@
           <w:sz w:val="21"/>
           <w:szCs w:val="21"/>
         </w:rPr>
-        <w:t>[3] Espressif Systems, “human_face_detect / human_face_recognition Components Registry.” [Online]. Available: https://components.espressif.com/</w:t>
+        <w:t xml:space="preserve">[3] </w:t>
+      </w:r>
+      <w:proofErr w:type="spellStart"/>
+      <w:r>
+        <w:rPr>
+          <w:sz w:val="21"/>
+          <w:szCs w:val="21"/>
+        </w:rPr>
+        <w:t>Espressif</w:t>
+      </w:r>
+      <w:proofErr w:type="spellEnd"/>
+      <w:r>
+        <w:rPr>
+          <w:sz w:val="21"/>
+          <w:szCs w:val="21"/>
+        </w:rPr>
+        <w:t xml:space="preserve"> Systems, “</w:t>
+      </w:r>
+      <w:proofErr w:type="spellStart"/>
+      <w:r>
+        <w:rPr>
+          <w:sz w:val="21"/>
+          <w:szCs w:val="21"/>
+        </w:rPr>
+        <w:t>human_face_detect</w:t>
+      </w:r>
+      <w:proofErr w:type="spellEnd"/>
+      <w:r>
+        <w:rPr>
+          <w:sz w:val="21"/>
+          <w:szCs w:val="21"/>
+        </w:rPr>
+        <w:t xml:space="preserve"> / </w:t>
+      </w:r>
+      <w:proofErr w:type="spellStart"/>
+      <w:r>
+        <w:rPr>
+          <w:sz w:val="21"/>
+          <w:szCs w:val="21"/>
+        </w:rPr>
+        <w:t>human_face_recognition</w:t>
+      </w:r>
+      <w:proofErr w:type="spellEnd"/>
+      <w:r>
+        <w:rPr>
+          <w:sz w:val="21"/>
+          <w:szCs w:val="21"/>
+        </w:rPr>
+        <w:t xml:space="preserve"> Components Registry.” [Online]. Available: https://components.espressif.com/</w:t>
       </w:r>
     </w:p>
     <w:p>
@@ -32709,7 +32839,39 @@
           <w:sz w:val="21"/>
           <w:szCs w:val="21"/>
         </w:rPr>
-        <w:t>[4] FreeRTOS Team, “The FreeRTOS Reference Manual.” [Online]. Available: https://www.freertos.org/</w:t>
+        <w:t xml:space="preserve">[4] </w:t>
+      </w:r>
+      <w:proofErr w:type="spellStart"/>
+      <w:r>
+        <w:rPr>
+          <w:sz w:val="21"/>
+          <w:szCs w:val="21"/>
+        </w:rPr>
+        <w:t>FreeRTOS</w:t>
+      </w:r>
+      <w:proofErr w:type="spellEnd"/>
+      <w:r>
+        <w:rPr>
+          <w:sz w:val="21"/>
+          <w:szCs w:val="21"/>
+        </w:rPr>
+        <w:t xml:space="preserve"> Team, “The </w:t>
+      </w:r>
+      <w:proofErr w:type="spellStart"/>
+      <w:r>
+        <w:rPr>
+          <w:sz w:val="21"/>
+          <w:szCs w:val="21"/>
+        </w:rPr>
+        <w:t>FreeRTOS</w:t>
+      </w:r>
+      <w:proofErr w:type="spellEnd"/>
+      <w:r>
+        <w:rPr>
+          <w:sz w:val="21"/>
+          <w:szCs w:val="21"/>
+        </w:rPr>
+        <w:t xml:space="preserve"> Reference Manual.” [Online]. Available: https://www.freertos.org/</w:t>
       </w:r>
     </w:p>
     <w:p>
@@ -32751,7 +32913,39 @@
           <w:sz w:val="21"/>
           <w:szCs w:val="21"/>
         </w:rPr>
-        <w:t>[7] Eclipse Mosquitto, “Mosquitto Documentation.” [Online]. Available: https://mosquitto.org/documentation/</w:t>
+        <w:t xml:space="preserve">[7] Eclipse </w:t>
+      </w:r>
+      <w:proofErr w:type="spellStart"/>
+      <w:r>
+        <w:rPr>
+          <w:sz w:val="21"/>
+          <w:szCs w:val="21"/>
+        </w:rPr>
+        <w:t>Mosquitto</w:t>
+      </w:r>
+      <w:proofErr w:type="spellEnd"/>
+      <w:r>
+        <w:rPr>
+          <w:sz w:val="21"/>
+          <w:szCs w:val="21"/>
+        </w:rPr>
+        <w:t>, “</w:t>
+      </w:r>
+      <w:proofErr w:type="spellStart"/>
+      <w:r>
+        <w:rPr>
+          <w:sz w:val="21"/>
+          <w:szCs w:val="21"/>
+        </w:rPr>
+        <w:t>Mosquitto</w:t>
+      </w:r>
+      <w:proofErr w:type="spellEnd"/>
+      <w:r>
+        <w:rPr>
+          <w:sz w:val="21"/>
+          <w:szCs w:val="21"/>
+        </w:rPr>
+        <w:t xml:space="preserve"> Documentation.” [Online]. Available: https://mosquitto.org/documentation/</w:t>
       </w:r>
     </w:p>
     <w:p>
@@ -32807,7 +33001,39 @@
           <w:sz w:val="21"/>
           <w:szCs w:val="21"/>
         </w:rPr>
-        <w:t>[11] FastAPI, “FastAPI Documentation.” [Online]. Available: https://fastapi.tiangolo.com/</w:t>
+        <w:t xml:space="preserve">[11] </w:t>
+      </w:r>
+      <w:proofErr w:type="spellStart"/>
+      <w:r>
+        <w:rPr>
+          <w:sz w:val="21"/>
+          <w:szCs w:val="21"/>
+        </w:rPr>
+        <w:t>FastAPI</w:t>
+      </w:r>
+      <w:proofErr w:type="spellEnd"/>
+      <w:r>
+        <w:rPr>
+          <w:sz w:val="21"/>
+          <w:szCs w:val="21"/>
+        </w:rPr>
+        <w:t>, “</w:t>
+      </w:r>
+      <w:proofErr w:type="spellStart"/>
+      <w:r>
+        <w:rPr>
+          <w:sz w:val="21"/>
+          <w:szCs w:val="21"/>
+        </w:rPr>
+        <w:t>FastAPI</w:t>
+      </w:r>
+      <w:proofErr w:type="spellEnd"/>
+      <w:r>
+        <w:rPr>
+          <w:sz w:val="21"/>
+          <w:szCs w:val="21"/>
+        </w:rPr>
+        <w:t xml:space="preserve"> Documentation.” [Online]. Available: https://fastapi.tiangolo.com/</w:t>
       </w:r>
     </w:p>
     <w:p>
@@ -32835,7 +33061,39 @@
           <w:sz w:val="21"/>
           <w:szCs w:val="21"/>
         </w:rPr>
-        <w:t>[13] P. Warden and D. Situnayake, “TinyML: Machine Learning with TensorFlow Lite on Arduino and Ultra-Low-Power Microcontrollers,” O'Reilly Media, 2020.</w:t>
+        <w:t xml:space="preserve">[13] P. Warden and D. </w:t>
+      </w:r>
+      <w:proofErr w:type="spellStart"/>
+      <w:r>
+        <w:rPr>
+          <w:sz w:val="21"/>
+          <w:szCs w:val="21"/>
+        </w:rPr>
+        <w:t>Situnayake</w:t>
+      </w:r>
+      <w:proofErr w:type="spellEnd"/>
+      <w:r>
+        <w:rPr>
+          <w:sz w:val="21"/>
+          <w:szCs w:val="21"/>
+        </w:rPr>
+        <w:t>, “</w:t>
+      </w:r>
+      <w:proofErr w:type="spellStart"/>
+      <w:r>
+        <w:rPr>
+          <w:sz w:val="21"/>
+          <w:szCs w:val="21"/>
+        </w:rPr>
+        <w:t>TinyML</w:t>
+      </w:r>
+      <w:proofErr w:type="spellEnd"/>
+      <w:r>
+        <w:rPr>
+          <w:sz w:val="21"/>
+          <w:szCs w:val="21"/>
+        </w:rPr>
+        <w:t>: Machine Learning with TensorFlow Lite on Arduino and Ultra-Low-Power Microcontrollers,” O'Reilly Media, 2020.</w:t>
       </w:r>
     </w:p>
     <w:p>
@@ -32863,7 +33121,23 @@
           <w:sz w:val="21"/>
           <w:szCs w:val="21"/>
         </w:rPr>
-        <w:t>[15] W3C / FIDO Alliance, “Web Authentication (WebAuthn): An API for accessing Public Key Credentials.” [Online]. Available: https://www.w3.org/TR/webauthn/</w:t>
+        <w:t>[15] W3C / FIDO Alliance, “Web Authentication (</w:t>
+      </w:r>
+      <w:proofErr w:type="spellStart"/>
+      <w:r>
+        <w:rPr>
+          <w:sz w:val="21"/>
+          <w:szCs w:val="21"/>
+        </w:rPr>
+        <w:t>WebAuthn</w:t>
+      </w:r>
+      <w:proofErr w:type="spellEnd"/>
+      <w:r>
+        <w:rPr>
+          <w:sz w:val="21"/>
+          <w:szCs w:val="21"/>
+        </w:rPr>
+        <w:t>): An API for accessing Public Key Credentials.” [Online]. Available: https://www.w3.org/TR/webauthn/</w:t>
       </w:r>
     </w:p>
     <w:p>
@@ -32877,7 +33151,23 @@
           <w:sz w:val="21"/>
           <w:szCs w:val="21"/>
         </w:rPr>
-        <w:t>[16] Bosch Sensortec, “BME280 Combined Humidity and Pressure Sensor Datasheet.” [Online]. Available: https://www.bosch-sensortec.com/</w:t>
+        <w:t xml:space="preserve">[16] Bosch </w:t>
+      </w:r>
+      <w:proofErr w:type="spellStart"/>
+      <w:r>
+        <w:rPr>
+          <w:sz w:val="21"/>
+          <w:szCs w:val="21"/>
+        </w:rPr>
+        <w:t>Sensortec</w:t>
+      </w:r>
+      <w:proofErr w:type="spellEnd"/>
+      <w:r>
+        <w:rPr>
+          <w:sz w:val="21"/>
+          <w:szCs w:val="21"/>
+        </w:rPr>
+        <w:t>, “BME280 Combined Humidity and Pressure Sensor Datasheet.” [Online]. Available: https://www.bosch-sensortec.com/</w:t>
       </w:r>
     </w:p>
     <w:p>
@@ -32891,7 +33181,23 @@
           <w:sz w:val="21"/>
           <w:szCs w:val="21"/>
         </w:rPr>
-        <w:t>[17] Goodix, “GT911 Capacitive Touch Panel Controller Datasheet.” [Online]. Available: https://www.goodix.com/</w:t>
+        <w:t xml:space="preserve">[17] </w:t>
+      </w:r>
+      <w:proofErr w:type="spellStart"/>
+      <w:r>
+        <w:rPr>
+          <w:sz w:val="21"/>
+          <w:szCs w:val="21"/>
+        </w:rPr>
+        <w:t>Goodix</w:t>
+      </w:r>
+      <w:proofErr w:type="spellEnd"/>
+      <w:r>
+        <w:rPr>
+          <w:sz w:val="21"/>
+          <w:szCs w:val="21"/>
+        </w:rPr>
+        <w:t>, “GT911 Capacitive Touch Panel Controller Datasheet.” [Online]. Available: https://www.goodix.com/</w:t>
       </w:r>
     </w:p>
     <w:p>
@@ -32905,7 +33211,23 @@
           <w:sz w:val="21"/>
           <w:szCs w:val="21"/>
         </w:rPr>
-        <w:t>[18] Sitronix Technology, “ST7796 320x480 TFT Controller Datasheet.” [Online]. Available: https://www.sitronix.com.tw/</w:t>
+        <w:t xml:space="preserve">[18] </w:t>
+      </w:r>
+      <w:proofErr w:type="spellStart"/>
+      <w:r>
+        <w:rPr>
+          <w:sz w:val="21"/>
+          <w:szCs w:val="21"/>
+        </w:rPr>
+        <w:t>Sitronix</w:t>
+      </w:r>
+      <w:proofErr w:type="spellEnd"/>
+      <w:r>
+        <w:rPr>
+          <w:sz w:val="21"/>
+          <w:szCs w:val="21"/>
+        </w:rPr>
+        <w:t xml:space="preserve"> Technology, “ST7796 320x480 TFT Controller Datasheet.” [Online]. Available: https://www.sitronix.com.tw/</w:t>
       </w:r>
     </w:p>
     <w:p>
@@ -32965,7 +33287,23 @@
           <w:sz w:val="24"/>
           <w:szCs w:val="24"/>
         </w:rPr>
-        <w:t>The supporting infrastructure is fully local: an MQTT broker (Mosquitto) and the Home Assistant platform run as Docker containers on a home server. The system therefore operates with nothing more than the home modem, survives both international and domestic Internet outages, and even when the global network is available, no cloud service is required — user data stays inside the home network, preserving privacy and keeping network latency minimal. Four parallel user interfaces are provided: the on-device touch display (LVGL), a mobile web panel opened via QR scan, the Home Assistant web dashboard, and the Home Assistant companion app, all fed by a single source of state on the device.</w:t>
+        <w:t>The supporting infrastructure is fully local: an MQTT broker (</w:t>
+      </w:r>
+      <w:proofErr w:type="spellStart"/>
+      <w:r>
+        <w:rPr>
+          <w:sz w:val="24"/>
+          <w:szCs w:val="24"/>
+        </w:rPr>
+        <w:t>Mosquitto</w:t>
+      </w:r>
+      <w:proofErr w:type="spellEnd"/>
+      <w:r>
+        <w:rPr>
+          <w:sz w:val="24"/>
+          <w:szCs w:val="24"/>
+        </w:rPr>
+        <w:t>) and the Home Assistant platform run as Docker containers on a home server. The system therefore operates with nothing more than the home modem, survives both international and domestic Internet outages, and even when the global network is available, no cloud service is required — user data stays inside the home network, preserving privacy and keeping network latency minimal. Four parallel user interfaces are provided: the on-device touch display (LVGL), a mobile web panel opened via QR scan, the Home Assistant web dashboard, and the Home Assistant companion app, all fed by a single source of state on the device.</w:t>
       </w:r>
     </w:p>
     <w:p>
@@ -32979,7 +33317,39 @@
           <w:sz w:val="24"/>
           <w:szCs w:val="24"/>
         </w:rPr>
-        <w:t>Beyond vision, a lightweight behavior-learning agent (two logistic-regression models with offline pre-training at 94.2% / 93.6% validation accuracy and on-chip online SGD) learns user habits for lighting and fan control in a shadow-then-auto lifecycle; the door lock is deliberately never under model control. A three-layer face-based attendance system (device outbox → local FastAPI/SQLite server → Jalali-calendar Google Sheets archive and Bale messenger notifications) was also implemented and deployed. Reliability mechanisms — task watchdogs, a hardware-reset watchdog for the touch controller, and network-aware Wi-Fi/MQTT reconnection — were validated through end-to-end scenario testing. The project served as a practical rehearsal of the full breadth of undergraduate engineering education and established a stable platform for future research, including federated learning on microcontrollers.</w:t>
+        <w:t>Beyond vision, a lightweight behavior-learning agent (two logistic-regression models with offline pre-training at 94.2% / 93.6% validation accuracy and on-chip online SGD) learns user habits for lighting and fan control in a shadow-</w:t>
+      </w:r>
+      <w:proofErr w:type="gramStart"/>
+      <w:r>
+        <w:rPr>
+          <w:sz w:val="24"/>
+          <w:szCs w:val="24"/>
+        </w:rPr>
+        <w:t>then</w:t>
+      </w:r>
+      <w:proofErr w:type="gramEnd"/>
+      <w:r>
+        <w:rPr>
+          <w:sz w:val="24"/>
+          <w:szCs w:val="24"/>
+        </w:rPr>
+        <w:t xml:space="preserve">-auto lifecycle; the door lock is deliberately never under model control. A three-layer face-based attendance system (device outbox → local </w:t>
+      </w:r>
+      <w:proofErr w:type="spellStart"/>
+      <w:r>
+        <w:rPr>
+          <w:sz w:val="24"/>
+          <w:szCs w:val="24"/>
+        </w:rPr>
+        <w:t>FastAPI</w:t>
+      </w:r>
+      <w:proofErr w:type="spellEnd"/>
+      <w:r>
+        <w:rPr>
+          <w:sz w:val="24"/>
+          <w:szCs w:val="24"/>
+        </w:rPr>
+        <w:t>/SQLite server → Jalali-calendar Google Sheets archive and Bale messenger notifications) was also implemented and deployed. Reliability mechanisms — task watchdogs, a hardware-reset watchdog for the touch controller, and network-aware Wi-Fi/MQTT reconnection — were validated through end-to-end scenario testing. The project served as a practical rehearsal of the full breadth of undergraduate engineering education and established a stable platform for future research, including federated learning on microcontrollers.</w:t>
       </w:r>
     </w:p>
     <w:p>
@@ -33002,7 +33372,39 @@
           <w:sz w:val="24"/>
           <w:szCs w:val="24"/>
         </w:rPr>
-        <w:t>Internet of Things, Edge AI, TinyML, ESP32-S3, Face Recognition, MQTT, Home Assistant, Docker, FreeRTOS, LVGL, Privacy, Local-first</w:t>
+        <w:t xml:space="preserve">Internet of Things, Edge AI, </w:t>
+      </w:r>
+      <w:proofErr w:type="spellStart"/>
+      <w:r>
+        <w:rPr>
+          <w:sz w:val="24"/>
+          <w:szCs w:val="24"/>
+        </w:rPr>
+        <w:t>TinyML</w:t>
+      </w:r>
+      <w:proofErr w:type="spellEnd"/>
+      <w:r>
+        <w:rPr>
+          <w:sz w:val="24"/>
+          <w:szCs w:val="24"/>
+        </w:rPr>
+        <w:t xml:space="preserve">, ESP32-S3, Face Recognition, MQTT, Home Assistant, Docker, </w:t>
+      </w:r>
+      <w:proofErr w:type="spellStart"/>
+      <w:r>
+        <w:rPr>
+          <w:sz w:val="24"/>
+          <w:szCs w:val="24"/>
+        </w:rPr>
+        <w:t>FreeRTOS</w:t>
+      </w:r>
+      <w:proofErr w:type="spellEnd"/>
+      <w:r>
+        <w:rPr>
+          <w:sz w:val="24"/>
+          <w:szCs w:val="24"/>
+        </w:rPr>
+        <w:t>, LVGL, Privacy, Local-first</w:t>
       </w:r>
     </w:p>
     <w:p>
@@ -33331,7 +33733,16 @@
         <w:szCs w:val="21"/>
         <w:rtl/>
       </w:rPr>
-      <w:t>39</w:t>
+      <w:t>3</w:t>
+    </w:r>
+    <w:r>
+      <w:rPr>
+        <w:rFonts w:cs="Times New Roman"/>
+        <w:sz w:val="21"/>
+        <w:szCs w:val="21"/>
+        <w:rtl/>
+      </w:rPr>
+      <w:t>9</w:t>
     </w:r>
     <w:r>
       <w:rPr>
@@ -33382,7 +33793,16 @@
         <w:szCs w:val="21"/>
         <w:rtl/>
       </w:rPr>
-      <w:t>40</w:t>
+      <w:t>4</w:t>
+    </w:r>
+    <w:r>
+      <w:rPr>
+        <w:rFonts w:cs="Times New Roman"/>
+        <w:sz w:val="21"/>
+        <w:szCs w:val="21"/>
+        <w:rtl/>
+      </w:rPr>
+      <w:t>0</w:t>
     </w:r>
     <w:r>
       <w:rPr>
@@ -33489,7 +33909,21 @@
         <w:rPr>
           <w:rStyle w:val="Hyperlink"/>
         </w:rPr>
-        <w:t xml:space="preserve"> CNN : </w:t>
+        <w:t xml:space="preserve"> </w:t>
+      </w:r>
+      <w:proofErr w:type="gramStart"/>
+      <w:r>
+        <w:rPr>
+          <w:rStyle w:val="Hyperlink"/>
+        </w:rPr>
+        <w:t>CNN :</w:t>
+      </w:r>
+      <w:proofErr w:type="gramEnd"/>
+      <w:r>
+        <w:rPr>
+          <w:rStyle w:val="Hyperlink"/>
+        </w:rPr>
+        <w:t xml:space="preserve"> </w:t>
       </w:r>
       <w:r>
         <w:rPr>
@@ -33583,7 +34017,23 @@
             <w:rStyle w:val="Hyperlink"/>
             <w:u w:val="none"/>
           </w:rPr>
-          <w:t xml:space="preserve"> SGD : </w:t>
+          <w:t xml:space="preserve"> </w:t>
+        </w:r>
+        <w:proofErr w:type="gramStart"/>
+        <w:r>
+          <w:rPr>
+            <w:rStyle w:val="Hyperlink"/>
+            <w:u w:val="none"/>
+          </w:rPr>
+          <w:t>SGD :</w:t>
+        </w:r>
+        <w:proofErr w:type="gramEnd"/>
+        <w:r>
+          <w:rPr>
+            <w:rStyle w:val="Hyperlink"/>
+            <w:u w:val="none"/>
+          </w:rPr>
+          <w:t xml:space="preserve"> </w:t>
         </w:r>
         <w:hyperlink r:id="rId3" w:history="1">
           <w:r>
@@ -33602,7 +34052,6 @@
       <w:pPr>
         <w:pStyle w:val="FootnoteText"/>
         <w:rPr>
-          <w:rFonts w:hint="cs"/>
           <w:rtl/>
         </w:rPr>
       </w:pPr>
@@ -33628,7 +34077,6 @@
       <w:pPr>
         <w:pStyle w:val="FootnoteText"/>
         <w:rPr>
-          <w:rFonts w:hint="cs"/>
           <w:rtl/>
         </w:rPr>
       </w:pPr>
@@ -33654,7 +34102,6 @@
       <w:pPr>
         <w:pStyle w:val="FootnoteText"/>
         <w:rPr>
-          <w:rFonts w:hint="cs"/>
           <w:rtl/>
         </w:rPr>
       </w:pPr>
@@ -33665,28 +34112,15 @@
         <w:footnoteRef/>
       </w:r>
       <w:r>
-        <w:t xml:space="preserve"> LWT :</w:t>
-      </w:r>
-      <w:r>
-        <w:t xml:space="preserve"> </w:t>
-      </w:r>
-      <w:r>
-        <w:t>L</w:t>
-      </w:r>
-      <w:r>
-        <w:t xml:space="preserve">ast </w:t>
-      </w:r>
-      <w:r>
-        <w:t>W</w:t>
-      </w:r>
-      <w:r>
-        <w:t xml:space="preserve">ill and </w:t>
-      </w:r>
-      <w:r>
-        <w:t>T</w:t>
-      </w:r>
-      <w:r>
-        <w:t>estament</w:t>
+        <w:t xml:space="preserve"> </w:t>
+      </w:r>
+      <w:proofErr w:type="gramStart"/>
+      <w:r>
+        <w:t>LWT :</w:t>
+      </w:r>
+      <w:proofErr w:type="gramEnd"/>
+      <w:r>
+        <w:t xml:space="preserve"> Last Will and Testament</w:t>
       </w:r>
     </w:p>
   </w:footnote>
@@ -33695,7 +34129,6 @@
       <w:pPr>
         <w:pStyle w:val="FootnoteText"/>
         <w:rPr>
-          <w:rFonts w:hint="cs"/>
           <w:rtl/>
         </w:rPr>
       </w:pPr>
@@ -33721,7 +34154,6 @@
       <w:pPr>
         <w:pStyle w:val="FootnoteText"/>
         <w:rPr>
-          <w:rFonts w:hint="cs"/>
           <w:rtl/>
         </w:rPr>
       </w:pPr>
@@ -33738,7 +34170,13 @@
         <w:rPr>
           <w:rtl/>
         </w:rPr>
-        <w:t>MQTT Discovery</w:t>
+        <w:t xml:space="preserve">MQTT </w:t>
+      </w:r>
+      <w:r>
+        <w:rPr>
+          <w:rtl/>
+        </w:rPr>
+        <w:t>Discovery</w:t>
       </w:r>
     </w:p>
   </w:footnote>
@@ -33763,7 +34201,15 @@
         <w:t>TWDT</w:t>
       </w:r>
       <w:r>
-        <w:t xml:space="preserve"> : Task of WatchDog Timer </w:t>
+        <w:t xml:space="preserve"> : Task of </w:t>
+      </w:r>
+      <w:proofErr w:type="spellStart"/>
+      <w:r>
+        <w:t>WatchDog</w:t>
+      </w:r>
+      <w:proofErr w:type="spellEnd"/>
+      <w:r>
+        <w:t xml:space="preserve"> Timer </w:t>
       </w:r>
     </w:p>
   </w:footnote>
@@ -33772,7 +34218,6 @@
       <w:pPr>
         <w:pStyle w:val="FootnoteText"/>
         <w:rPr>
-          <w:rFonts w:hint="cs"/>
           <w:rtl/>
         </w:rPr>
       </w:pPr>
@@ -33783,10 +34228,7 @@
         <w:footnoteRef/>
       </w:r>
       <w:r>
-        <w:t xml:space="preserve"> </w:t>
-      </w:r>
-      <w:r>
-        <w:t>context-only</w:t>
+        <w:t xml:space="preserve"> context-only</w:t>
       </w:r>
     </w:p>
   </w:footnote>
@@ -33795,7 +34237,6 @@
       <w:pPr>
         <w:pStyle w:val="FootnoteText"/>
         <w:rPr>
-          <w:rFonts w:hint="cs"/>
           <w:rtl/>
         </w:rPr>
       </w:pPr>
@@ -33806,10 +34247,7 @@
         <w:footnoteRef/>
       </w:r>
       <w:r>
-        <w:t xml:space="preserve"> </w:t>
-      </w:r>
-      <w:r>
-        <w:t>sinusoidal harmonics</w:t>
+        <w:t xml:space="preserve"> sinusoidal harmonics</w:t>
       </w:r>
     </w:p>
   </w:footnote>
@@ -33818,7 +34256,6 @@
       <w:pPr>
         <w:pStyle w:val="FootnoteText"/>
         <w:rPr>
-          <w:rFonts w:hint="cs"/>
           <w:rtl/>
         </w:rPr>
       </w:pPr>
@@ -33829,10 +34266,7 @@
         <w:footnoteRef/>
       </w:r>
       <w:r>
-        <w:t xml:space="preserve"> </w:t>
-      </w:r>
-      <w:r>
-        <w:t>inertial behavior</w:t>
+        <w:t xml:space="preserve"> inertial behavior</w:t>
       </w:r>
     </w:p>
   </w:footnote>
@@ -33917,7 +34351,6 @@
       <w:pPr>
         <w:pStyle w:val="FootnoteText"/>
         <w:rPr>
-          <w:rFonts w:hint="cs"/>
           <w:rtl/>
         </w:rPr>
       </w:pPr>
@@ -35638,6 +36071,7 @@
   <w:style w:type="character" w:default="1" w:styleId="DefaultParagraphFont">
     <w:name w:val="Default Paragraph Font"/>
     <w:uiPriority w:val="1"/>
+    <w:semiHidden/>
     <w:unhideWhenUsed/>
   </w:style>
   <w:style w:type="table" w:default="1" w:styleId="TableNormal">

</xml_diff>